<commit_message>
Update prompt pack pricing and files
</commit_message>
<xml_diff>
--- a/1000 Prompt/FORMAT_FINAL_CLEAN/PACK 1 – 100 PROMPT KINH DOANH & STARTUP.docx
+++ b/1000 Prompt/FORMAT_FINAL_CLEAN/PACK 1 – 100 PROMPT KINH DOANH & STARTUP.docx
@@ -12,7 +12,8 @@
           <w:right w:val="nil"/>
           <w:between w:val="nil"/>
         </w:pBdr>
-        <w:spacing/>
+        <w:spacing w:before="120" w:after="120" w:line="240" w:lineRule="auto"/>
+        <w:jc w:val="both"/>
         <w:rPr>
           <w:rFonts w:ascii="Times New Roman" w:hAnsi="Times New Roman" w:cs="Times New Roman"/>
           <w:b/>
@@ -24,7 +25,7 @@
       </w:pPr>
       <w:r>
         <w:rPr>
-          <w:rFonts w:ascii="Times New Roman" w:hAnsi="Times New Roman" w:eastAsia="Times New Roman"/>
+          <w:rFonts w:ascii="Times New Roman" w:eastAsia="Times New Roman" w:hAnsi="Times New Roman"/>
           <w:b/>
           <w:sz w:val="28"/>
         </w:rPr>
@@ -33,7 +34,8 @@
     </w:p>
     <w:p>
       <w:pPr>
-        <w:spacing/>
+        <w:spacing w:before="120" w:after="120" w:line="240" w:lineRule="auto"/>
+        <w:jc w:val="both"/>
         <w:rPr>
           <w:rFonts w:ascii="Times New Roman" w:hAnsi="Times New Roman" w:cs="Times New Roman"/>
           <w:b/>
@@ -45,7 +47,7 @@
       </w:pPr>
       <w:r>
         <w:rPr>
-          <w:rFonts w:ascii="Times New Roman" w:hAnsi="Times New Roman" w:eastAsia="Times New Roman"/>
+          <w:rFonts w:ascii="Times New Roman" w:eastAsia="Times New Roman" w:hAnsi="Times New Roman"/>
           <w:b/>
           <w:sz w:val="28"/>
         </w:rPr>
@@ -54,7 +56,8 @@
     </w:p>
     <w:p>
       <w:pPr>
-        <w:spacing/>
+        <w:spacing w:before="120" w:after="120" w:line="240" w:lineRule="auto"/>
+        <w:jc w:val="both"/>
         <w:rPr>
           <w:rFonts w:ascii="Times New Roman" w:hAnsi="Times New Roman" w:cs="Times New Roman"/>
           <w:i/>
@@ -66,7 +69,7 @@
       </w:pPr>
       <w:r>
         <w:rPr>
-          <w:rFonts w:ascii="Times New Roman" w:hAnsi="Times New Roman" w:eastAsia="Times New Roman"/>
+          <w:rFonts w:ascii="Times New Roman" w:eastAsia="Times New Roman" w:hAnsi="Times New Roman"/>
           <w:i/>
           <w:sz w:val="28"/>
         </w:rPr>
@@ -75,7 +78,8 @@
     </w:p>
     <w:p>
       <w:pPr>
-        <w:spacing/>
+        <w:spacing w:before="120" w:after="120" w:line="240" w:lineRule="auto"/>
+        <w:jc w:val="both"/>
         <w:rPr>
           <w:rFonts w:ascii="Times New Roman" w:hAnsi="Times New Roman" w:cs="Times New Roman"/>
           <w:i/>
@@ -87,7 +91,7 @@
       </w:pPr>
       <w:r>
         <w:rPr>
-          <w:rFonts w:ascii="Times New Roman" w:hAnsi="Times New Roman" w:eastAsia="Times New Roman"/>
+          <w:rFonts w:ascii="Times New Roman" w:eastAsia="Times New Roman" w:hAnsi="Times New Roman"/>
           <w:i/>
           <w:sz w:val="28"/>
         </w:rPr>
@@ -96,7 +100,8 @@
     </w:p>
     <w:p>
       <w:pPr>
-        <w:spacing/>
+        <w:spacing w:before="120" w:after="120" w:line="240" w:lineRule="auto"/>
+        <w:jc w:val="both"/>
         <w:rPr>
           <w:rFonts w:ascii="Times New Roman" w:hAnsi="Times New Roman" w:cs="Times New Roman"/>
           <w:i/>
@@ -108,7 +113,7 @@
       </w:pPr>
       <w:r>
         <w:rPr>
-          <w:rFonts w:ascii="Times New Roman" w:hAnsi="Times New Roman" w:eastAsia="Times New Roman"/>
+          <w:rFonts w:ascii="Times New Roman" w:eastAsia="Times New Roman" w:hAnsi="Times New Roman"/>
           <w:i/>
           <w:sz w:val="28"/>
         </w:rPr>
@@ -117,7 +122,8 @@
     </w:p>
     <w:p>
       <w:pPr>
-        <w:spacing/>
+        <w:spacing w:before="120" w:after="120" w:line="240" w:lineRule="auto"/>
+        <w:jc w:val="both"/>
         <w:rPr>
           <w:rFonts w:ascii="Times New Roman" w:hAnsi="Times New Roman" w:cs="Times New Roman"/>
           <w:i/>
@@ -129,7 +135,7 @@
       </w:pPr>
       <w:r>
         <w:rPr>
-          <w:rFonts w:ascii="Times New Roman" w:hAnsi="Times New Roman" w:eastAsia="Times New Roman"/>
+          <w:rFonts w:ascii="Times New Roman" w:eastAsia="Times New Roman" w:hAnsi="Times New Roman"/>
           <w:i/>
           <w:sz w:val="28"/>
         </w:rPr>
@@ -138,7 +144,8 @@
     </w:p>
     <w:p>
       <w:pPr>
-        <w:spacing/>
+        <w:spacing w:before="120" w:after="120" w:line="240" w:lineRule="auto"/>
+        <w:jc w:val="both"/>
         <w:rPr>
           <w:rFonts w:ascii="Times New Roman" w:hAnsi="Times New Roman" w:cs="Times New Roman"/>
           <w:i/>
@@ -150,7 +157,7 @@
       </w:pPr>
       <w:r>
         <w:rPr>
-          <w:rFonts w:ascii="Times New Roman" w:hAnsi="Times New Roman" w:eastAsia="Times New Roman"/>
+          <w:rFonts w:ascii="Times New Roman" w:eastAsia="Times New Roman" w:hAnsi="Times New Roman"/>
           <w:i/>
           <w:sz w:val="28"/>
         </w:rPr>
@@ -159,7 +166,8 @@
     </w:p>
     <w:p>
       <w:pPr>
-        <w:spacing/>
+        <w:spacing w:before="120" w:after="120" w:line="240" w:lineRule="auto"/>
+        <w:jc w:val="both"/>
         <w:rPr>
           <w:rFonts w:ascii="Times New Roman" w:hAnsi="Times New Roman" w:cs="Times New Roman"/>
           <w:i/>
@@ -171,7 +179,7 @@
       </w:pPr>
       <w:r>
         <w:rPr>
-          <w:rFonts w:ascii="Times New Roman" w:hAnsi="Times New Roman" w:eastAsia="Times New Roman"/>
+          <w:rFonts w:ascii="Times New Roman" w:eastAsia="Times New Roman" w:hAnsi="Times New Roman"/>
           <w:i/>
           <w:sz w:val="28"/>
         </w:rPr>
@@ -180,7 +188,8 @@
     </w:p>
     <w:p>
       <w:pPr>
-        <w:spacing/>
+        <w:spacing w:before="120" w:after="120" w:line="240" w:lineRule="auto"/>
+        <w:jc w:val="both"/>
         <w:rPr>
           <w:rFonts w:ascii="Times New Roman" w:hAnsi="Times New Roman" w:cs="Times New Roman"/>
           <w:i/>
@@ -192,7 +201,7 @@
       </w:pPr>
       <w:r>
         <w:rPr>
-          <w:rFonts w:ascii="Times New Roman" w:hAnsi="Times New Roman" w:eastAsia="Times New Roman"/>
+          <w:rFonts w:ascii="Times New Roman" w:eastAsia="Times New Roman" w:hAnsi="Times New Roman"/>
           <w:i/>
           <w:sz w:val="28"/>
         </w:rPr>
@@ -201,7 +210,8 @@
     </w:p>
     <w:p>
       <w:pPr>
-        <w:spacing/>
+        <w:spacing w:before="120" w:after="120" w:line="240" w:lineRule="auto"/>
+        <w:jc w:val="both"/>
         <w:rPr>
           <w:rFonts w:ascii="Times New Roman" w:hAnsi="Times New Roman" w:cs="Times New Roman"/>
           <w:i/>
@@ -213,7 +223,7 @@
       </w:pPr>
       <w:r>
         <w:rPr>
-          <w:rFonts w:ascii="Times New Roman" w:hAnsi="Times New Roman" w:eastAsia="Times New Roman"/>
+          <w:rFonts w:ascii="Times New Roman" w:eastAsia="Times New Roman" w:hAnsi="Times New Roman"/>
           <w:i/>
           <w:sz w:val="28"/>
         </w:rPr>
@@ -222,7 +232,8 @@
     </w:p>
     <w:p>
       <w:pPr>
-        <w:spacing/>
+        <w:spacing w:before="120" w:after="120" w:line="240" w:lineRule="auto"/>
+        <w:jc w:val="both"/>
         <w:rPr>
           <w:rFonts w:ascii="Times New Roman" w:hAnsi="Times New Roman" w:cs="Times New Roman"/>
           <w:i/>
@@ -234,7 +245,7 @@
       </w:pPr>
       <w:r>
         <w:rPr>
-          <w:rFonts w:ascii="Times New Roman" w:hAnsi="Times New Roman" w:eastAsia="Times New Roman"/>
+          <w:rFonts w:ascii="Times New Roman" w:eastAsia="Times New Roman" w:hAnsi="Times New Roman"/>
           <w:i/>
           <w:sz w:val="28"/>
         </w:rPr>
@@ -243,30 +254,41 @@
     </w:p>
     <w:p>
       <w:pPr>
-        <w:spacing/>
-        <w:rPr>
-          <w:rFonts w:ascii="Times New Roman" w:hAnsi="Times New Roman" w:cs="Times New Roman"/>
+        <w:spacing w:before="120" w:after="120" w:line="240" w:lineRule="auto"/>
+        <w:jc w:val="both"/>
+        <w:rPr>
+          <w:rFonts w:ascii="Times New Roman" w:eastAsia="Times New Roman" w:hAnsi="Times New Roman"/>
           <w:i/>
+          <w:sz w:val="28"/>
+          <w:lang w:val="en-US"/>
+        </w:rPr>
+      </w:pPr>
+      <w:r>
+        <w:rPr>
+          <w:rFonts w:ascii="Times New Roman" w:eastAsia="Times New Roman" w:hAnsi="Times New Roman"/>
+          <w:i/>
+          <w:sz w:val="28"/>
+        </w:rPr>
+        <w:t>10. Truyền cảm hứng &amp; Lãnh đạo tư duy (10 prompt): Các bài diễn văn, slogan và tuyên ngôn sứ mệnh để xây dựng văn hóa doanh nghiệp.</w:t>
+      </w:r>
+    </w:p>
+    <w:p>
+      <w:pPr>
+        <w:spacing w:before="120" w:after="120" w:line="240" w:lineRule="auto"/>
+        <w:jc w:val="both"/>
+        <w:rPr>
+          <w:rFonts w:ascii="Times New Roman" w:hAnsi="Times New Roman" w:cs="Times New Roman"/>
           <w:iCs/>
           <w:sz w:val="28"/>
           <w:szCs w:val="28"/>
           <w:lang w:val="en-US"/>
         </w:rPr>
       </w:pPr>
-      <w:r>
-        <w:rPr>
-          <w:rFonts w:ascii="Times New Roman" w:hAnsi="Times New Roman" w:eastAsia="Times New Roman"/>
-          <w:i/>
-          <w:sz w:val="28"/>
-        </w:rPr>
-        <w:t>10. Truyền cảm hứng &amp; Lãnh đạo tư duy (10 prompt): Các bài diễn văn, slogan và tuyên ngôn sứ mệnh để xây dựng văn hóa doanh nghiệp.</w:t>
-      </w:r>
-    </w:p>
-    <w:p>
-      <w:pPr>
-        <w:keepNext w:val="0"/>
-        <w:keepLines w:val="0"/>
-        <w:spacing/>
+    </w:p>
+    <w:p>
+      <w:pPr>
+        <w:spacing w:before="120" w:after="120" w:line="240" w:lineRule="auto"/>
+        <w:jc w:val="both"/>
         <w:rPr>
           <w:rFonts w:ascii="Times New Roman" w:hAnsi="Times New Roman" w:cs="Times New Roman"/>
           <w:b/>
@@ -277,7 +299,7 @@
       </w:pPr>
       <w:r>
         <w:rPr>
-          <w:rFonts w:ascii="Times New Roman" w:hAnsi="Times New Roman" w:eastAsia="Times New Roman"/>
+          <w:rFonts w:ascii="Times New Roman" w:eastAsia="Times New Roman" w:hAnsi="Times New Roman"/>
           <w:b/>
           <w:sz w:val="28"/>
         </w:rPr>
@@ -286,55 +308,56 @@
     </w:p>
     <w:p>
       <w:pPr>
-        <w:spacing/>
-        <w:ind w:left="620" w:hanging="360"/>
-        <w:rPr>
-          <w:rFonts w:ascii="Times New Roman" w:hAnsi="Times New Roman" w:cs="Times New Roman"/>
-          <w:sz w:val="28"/>
-          <w:szCs w:val="28"/>
-        </w:rPr>
-      </w:pPr>
-      <w:r>
-        <w:rPr>
-          <w:rFonts w:ascii="Times New Roman" w:hAnsi="Times New Roman" w:eastAsia="Times New Roman"/>
+        <w:spacing w:before="120" w:after="120" w:line="240" w:lineRule="auto"/>
+        <w:ind w:left="620" w:hanging="360"/>
+        <w:jc w:val="both"/>
+        <w:rPr>
+          <w:rFonts w:ascii="Times New Roman" w:hAnsi="Times New Roman" w:cs="Times New Roman"/>
+          <w:sz w:val="28"/>
+          <w:szCs w:val="28"/>
+        </w:rPr>
+      </w:pPr>
+      <w:r>
+        <w:rPr>
+          <w:rFonts w:ascii="Times New Roman" w:eastAsia="Times New Roman" w:hAnsi="Times New Roman"/>
           <w:sz w:val="28"/>
         </w:rPr>
         <w:t>1.  Hãy vào vai chuyên gia chiến lược, phân tích thị trường Việt Nam và xây dựng bản kế hoạch phát triển SP/DV = [___] trong 12 tháng tới, trình bày thành bảng Chiến lược – Mục tiêu – KPI, có phản biện từ CEO, nhà đầu tư và khách hàng.</w:t>
       </w:r>
     </w:p>
-    <w:bookmarkEnd w:id="1"/>
-    <w:p>
-      <w:pPr>
-        <w:spacing/>
-        <w:ind w:left="620" w:hanging="360"/>
-        <w:rPr>
-          <w:rFonts w:ascii="Times New Roman" w:hAnsi="Times New Roman" w:cs="Times New Roman"/>
-          <w:sz w:val="28"/>
-          <w:szCs w:val="28"/>
-        </w:rPr>
-      </w:pPr>
-      <w:r>
-        <w:rPr>
-          <w:rFonts w:ascii="Times New Roman" w:hAnsi="Times New Roman" w:eastAsia="Times New Roman"/>
+    <w:p>
+      <w:pPr>
+        <w:spacing w:before="120" w:after="120" w:line="240" w:lineRule="auto"/>
+        <w:ind w:left="620" w:hanging="360"/>
+        <w:jc w:val="both"/>
+        <w:rPr>
+          <w:rFonts w:ascii="Times New Roman" w:hAnsi="Times New Roman" w:cs="Times New Roman"/>
+          <w:sz w:val="28"/>
+          <w:szCs w:val="28"/>
+        </w:rPr>
+      </w:pPr>
+      <w:r>
+        <w:rPr>
+          <w:rFonts w:ascii="Times New Roman" w:eastAsia="Times New Roman" w:hAnsi="Times New Roman"/>
           <w:sz w:val="28"/>
         </w:rPr>
         <w:t>2.  Viết kế hoạch tăng trưởng 5 năm cho SP/DV = [___], theo mô hình SWOT + 5 lực lượng Porter, chỉ rõ cơ hội mở rộng thị trường và cách ứng phó đối thủ.</w:t>
       </w:r>
     </w:p>
-    <w:bookmarkEnd w:id="2"/>
-    <w:p>
-      <w:pPr>
-        <w:spacing/>
-        <w:ind w:left="620" w:hanging="360"/>
-        <w:rPr>
-          <w:rFonts w:ascii="Times New Roman" w:hAnsi="Times New Roman" w:cs="Times New Roman"/>
-          <w:sz w:val="28"/>
-          <w:szCs w:val="28"/>
-        </w:rPr>
-      </w:pPr>
-      <w:r>
-        <w:rPr>
-          <w:rFonts w:ascii="Times New Roman" w:hAnsi="Times New Roman" w:eastAsia="Times New Roman"/>
+    <w:p>
+      <w:pPr>
+        <w:spacing w:before="120" w:after="120" w:line="240" w:lineRule="auto"/>
+        <w:ind w:left="620" w:hanging="360"/>
+        <w:jc w:val="both"/>
+        <w:rPr>
+          <w:rFonts w:ascii="Times New Roman" w:hAnsi="Times New Roman" w:cs="Times New Roman"/>
+          <w:sz w:val="28"/>
+          <w:szCs w:val="28"/>
+        </w:rPr>
+      </w:pPr>
+      <w:r>
+        <w:rPr>
+          <w:rFonts w:ascii="Times New Roman" w:eastAsia="Times New Roman" w:hAnsi="Times New Roman"/>
           <w:sz w:val="28"/>
         </w:rPr>
         <w:t>3.  Tạo bản đồ chiến lược Blue Ocean cho SP/DV = [___], tập trung vào điểm khác biệt và giá trị độc đáo để tránh cạnh tranh trực diện.</w:t>
@@ -342,17 +365,18 @@
     </w:p>
     <w:p>
       <w:pPr>
-        <w:spacing/>
-        <w:ind w:left="620" w:hanging="360"/>
-        <w:rPr>
-          <w:rFonts w:ascii="Times New Roman" w:hAnsi="Times New Roman" w:cs="Times New Roman"/>
-          <w:sz w:val="28"/>
-          <w:szCs w:val="28"/>
-        </w:rPr>
-      </w:pPr>
-      <w:r>
-        <w:rPr>
-          <w:rFonts w:ascii="Times New Roman" w:hAnsi="Times New Roman" w:eastAsia="Times New Roman"/>
+        <w:spacing w:before="120" w:after="120" w:line="240" w:lineRule="auto"/>
+        <w:ind w:left="620" w:hanging="360"/>
+        <w:jc w:val="both"/>
+        <w:rPr>
+          <w:rFonts w:ascii="Times New Roman" w:hAnsi="Times New Roman" w:cs="Times New Roman"/>
+          <w:sz w:val="28"/>
+          <w:szCs w:val="28"/>
+        </w:rPr>
+      </w:pPr>
+      <w:r>
+        <w:rPr>
+          <w:rFonts w:ascii="Times New Roman" w:eastAsia="Times New Roman" w:hAnsi="Times New Roman"/>
           <w:sz w:val="28"/>
         </w:rPr>
         <w:t>4.  Phân tích chuỗi giá trị và đề xuất cách tối ưu chi phí vận hành cho SP/DV = [___], kèm bảng phân bổ nguồn lực.</w:t>
@@ -360,17 +384,18 @@
     </w:p>
     <w:p>
       <w:pPr>
-        <w:spacing/>
-        <w:ind w:left="620" w:hanging="360"/>
-        <w:rPr>
-          <w:rFonts w:ascii="Times New Roman" w:hAnsi="Times New Roman" w:cs="Times New Roman"/>
-          <w:sz w:val="28"/>
-          <w:szCs w:val="28"/>
-        </w:rPr>
-      </w:pPr>
-      <w:r>
-        <w:rPr>
-          <w:rFonts w:ascii="Times New Roman" w:hAnsi="Times New Roman" w:eastAsia="Times New Roman"/>
+        <w:spacing w:before="120" w:after="120" w:line="240" w:lineRule="auto"/>
+        <w:ind w:left="620" w:hanging="360"/>
+        <w:jc w:val="both"/>
+        <w:rPr>
+          <w:rFonts w:ascii="Times New Roman" w:hAnsi="Times New Roman" w:cs="Times New Roman"/>
+          <w:sz w:val="28"/>
+          <w:szCs w:val="28"/>
+        </w:rPr>
+      </w:pPr>
+      <w:r>
+        <w:rPr>
+          <w:rFonts w:ascii="Times New Roman" w:eastAsia="Times New Roman" w:hAnsi="Times New Roman"/>
           <w:sz w:val="28"/>
         </w:rPr>
         <w:t>5.  Lập kế hoạch ra mắt SP/DV = [___] trong 90 ngày, gồm chiến lược tiếp cận thị trường, định giá và kênh phân phối.</w:t>
@@ -378,35 +403,38 @@
     </w:p>
     <w:p>
       <w:pPr>
-        <w:spacing/>
-        <w:ind w:left="620" w:hanging="360"/>
-        <w:rPr>
-          <w:rFonts w:ascii="Times New Roman" w:hAnsi="Times New Roman" w:cs="Times New Roman"/>
-          <w:sz w:val="28"/>
-          <w:szCs w:val="28"/>
-        </w:rPr>
-      </w:pPr>
-      <w:r>
-        <w:rPr>
-          <w:rFonts w:ascii="Times New Roman" w:hAnsi="Times New Roman" w:eastAsia="Times New Roman"/>
-          <w:sz w:val="28"/>
-        </w:rPr>
+        <w:spacing w:before="120" w:after="120" w:line="240" w:lineRule="auto"/>
+        <w:ind w:left="620" w:hanging="360"/>
+        <w:jc w:val="both"/>
+        <w:rPr>
+          <w:rFonts w:ascii="Times New Roman" w:hAnsi="Times New Roman" w:cs="Times New Roman"/>
+          <w:sz w:val="28"/>
+          <w:szCs w:val="28"/>
+        </w:rPr>
+      </w:pPr>
+      <w:r>
+        <w:rPr>
+          <w:rFonts w:ascii="Times New Roman" w:eastAsia="Times New Roman" w:hAnsi="Times New Roman"/>
+          <w:sz w:val="28"/>
+        </w:rPr>
+        <w:lastRenderedPageBreak/>
         <w:t>6.  Xây dựng roadmap scale SP/DV = [___] từ 100 khách hàng lên 10.000 khách hàng trong 2 năm.</w:t>
       </w:r>
     </w:p>
     <w:p>
       <w:pPr>
-        <w:spacing/>
-        <w:ind w:left="620" w:hanging="360"/>
-        <w:rPr>
-          <w:rFonts w:ascii="Times New Roman" w:hAnsi="Times New Roman" w:cs="Times New Roman"/>
-          <w:sz w:val="28"/>
-          <w:szCs w:val="28"/>
-        </w:rPr>
-      </w:pPr>
-      <w:r>
-        <w:rPr>
-          <w:rFonts w:ascii="Times New Roman" w:hAnsi="Times New Roman" w:eastAsia="Times New Roman"/>
+        <w:spacing w:before="120" w:after="120" w:line="240" w:lineRule="auto"/>
+        <w:ind w:left="620" w:hanging="360"/>
+        <w:jc w:val="both"/>
+        <w:rPr>
+          <w:rFonts w:ascii="Times New Roman" w:hAnsi="Times New Roman" w:cs="Times New Roman"/>
+          <w:sz w:val="28"/>
+          <w:szCs w:val="28"/>
+        </w:rPr>
+      </w:pPr>
+      <w:r>
+        <w:rPr>
+          <w:rFonts w:ascii="Times New Roman" w:eastAsia="Times New Roman" w:hAnsi="Times New Roman"/>
           <w:sz w:val="28"/>
         </w:rPr>
         <w:t>7.  Hãy đưa ra chiến lược đa dạng hóa sản phẩm/dịch vụ cho công ty đang kinh doanh SP/DV = [___], kèm phân tích rủi ro và lợi ích.</w:t>
@@ -414,17 +442,18 @@
     </w:p>
     <w:p>
       <w:pPr>
-        <w:spacing/>
-        <w:ind w:left="620" w:hanging="360"/>
-        <w:rPr>
-          <w:rFonts w:ascii="Times New Roman" w:hAnsi="Times New Roman" w:cs="Times New Roman"/>
-          <w:sz w:val="28"/>
-          <w:szCs w:val="28"/>
-        </w:rPr>
-      </w:pPr>
-      <w:r>
-        <w:rPr>
-          <w:rFonts w:ascii="Times New Roman" w:hAnsi="Times New Roman" w:eastAsia="Times New Roman"/>
+        <w:spacing w:before="120" w:after="120" w:line="240" w:lineRule="auto"/>
+        <w:ind w:left="620" w:hanging="360"/>
+        <w:jc w:val="both"/>
+        <w:rPr>
+          <w:rFonts w:ascii="Times New Roman" w:hAnsi="Times New Roman" w:cs="Times New Roman"/>
+          <w:sz w:val="28"/>
+          <w:szCs w:val="28"/>
+        </w:rPr>
+      </w:pPr>
+      <w:r>
+        <w:rPr>
+          <w:rFonts w:ascii="Times New Roman" w:eastAsia="Times New Roman" w:hAnsi="Times New Roman"/>
           <w:sz w:val="28"/>
         </w:rPr>
         <w:t>8.  Lập kế hoạch chuyển đổi số toàn diện cho doanh nghiệp đang cung cấp SP/DV = [___], tập trung vào CRM, automation và AI.</w:t>
@@ -432,17 +461,18 @@
     </w:p>
     <w:p>
       <w:pPr>
-        <w:spacing/>
-        <w:ind w:left="620" w:hanging="360"/>
-        <w:rPr>
-          <w:rFonts w:ascii="Times New Roman" w:hAnsi="Times New Roman" w:cs="Times New Roman"/>
-          <w:sz w:val="28"/>
-          <w:szCs w:val="28"/>
-        </w:rPr>
-      </w:pPr>
-      <w:r>
-        <w:rPr>
-          <w:rFonts w:ascii="Times New Roman" w:hAnsi="Times New Roman" w:eastAsia="Times New Roman"/>
+        <w:spacing w:before="120" w:after="120" w:line="240" w:lineRule="auto"/>
+        <w:ind w:left="620" w:hanging="360"/>
+        <w:jc w:val="both"/>
+        <w:rPr>
+          <w:rFonts w:ascii="Times New Roman" w:hAnsi="Times New Roman" w:cs="Times New Roman"/>
+          <w:sz w:val="28"/>
+          <w:szCs w:val="28"/>
+        </w:rPr>
+      </w:pPr>
+      <w:r>
+        <w:rPr>
+          <w:rFonts w:ascii="Times New Roman" w:eastAsia="Times New Roman" w:hAnsi="Times New Roman"/>
           <w:sz w:val="28"/>
         </w:rPr>
         <w:t>9.  Viết báo cáo phân tích cạnh tranh cho SP/DV = [___], so sánh trực tiếp với 3 đối thủ lớn nhất trên thị trường.</w:t>
@@ -450,17 +480,18 @@
     </w:p>
     <w:p>
       <w:pPr>
-        <w:spacing/>
-        <w:ind w:left="620" w:hanging="360"/>
-        <w:rPr>
-          <w:rFonts w:ascii="Times New Roman" w:hAnsi="Times New Roman" w:cs="Times New Roman"/>
-          <w:sz w:val="28"/>
-          <w:szCs w:val="28"/>
-        </w:rPr>
-      </w:pPr>
-      <w:r>
-        <w:rPr>
-          <w:rFonts w:ascii="Times New Roman" w:hAnsi="Times New Roman" w:eastAsia="Times New Roman"/>
+        <w:spacing w:before="120" w:after="120" w:line="240" w:lineRule="auto"/>
+        <w:ind w:left="620" w:hanging="360"/>
+        <w:jc w:val="both"/>
+        <w:rPr>
+          <w:rFonts w:ascii="Times New Roman" w:hAnsi="Times New Roman" w:cs="Times New Roman"/>
+          <w:sz w:val="28"/>
+          <w:szCs w:val="28"/>
+        </w:rPr>
+      </w:pPr>
+      <w:r>
+        <w:rPr>
+          <w:rFonts w:ascii="Times New Roman" w:eastAsia="Times New Roman" w:hAnsi="Times New Roman"/>
           <w:sz w:val="28"/>
         </w:rPr>
         <w:t>10.Đề xuất 5 chiến lược “tăng trưởng đột phá” cho SP/DV = [___] trong vòng 12 tháng, dựa trên xu hướng thị trường và hành vi khách hàng.</w:t>
@@ -468,9 +499,8 @@
     </w:p>
     <w:p>
       <w:pPr>
-        <w:keepNext w:val="0"/>
-        <w:keepLines w:val="0"/>
-        <w:spacing/>
+        <w:spacing w:before="120" w:after="120" w:line="240" w:lineRule="auto"/>
+        <w:jc w:val="both"/>
         <w:rPr>
           <w:rFonts w:ascii="Times New Roman" w:hAnsi="Times New Roman" w:cs="Times New Roman"/>
           <w:b/>
@@ -481,7 +511,7 @@
       </w:pPr>
       <w:r>
         <w:rPr>
-          <w:rFonts w:ascii="Times New Roman" w:hAnsi="Times New Roman" w:eastAsia="Times New Roman"/>
+          <w:rFonts w:ascii="Times New Roman" w:eastAsia="Times New Roman" w:hAnsi="Times New Roman"/>
           <w:b/>
           <w:sz w:val="28"/>
         </w:rPr>
@@ -490,17 +520,18 @@
     </w:p>
     <w:p>
       <w:pPr>
-        <w:spacing/>
-        <w:ind w:left="620" w:hanging="360"/>
-        <w:rPr>
-          <w:rFonts w:ascii="Times New Roman" w:hAnsi="Times New Roman" w:cs="Times New Roman"/>
-          <w:sz w:val="28"/>
-          <w:szCs w:val="28"/>
-        </w:rPr>
-      </w:pPr>
-      <w:r>
-        <w:rPr>
-          <w:rFonts w:ascii="Times New Roman" w:hAnsi="Times New Roman" w:eastAsia="Times New Roman"/>
+        <w:spacing w:before="120" w:after="120" w:line="240" w:lineRule="auto"/>
+        <w:ind w:left="620" w:hanging="360"/>
+        <w:jc w:val="both"/>
+        <w:rPr>
+          <w:rFonts w:ascii="Times New Roman" w:hAnsi="Times New Roman" w:cs="Times New Roman"/>
+          <w:sz w:val="28"/>
+          <w:szCs w:val="28"/>
+        </w:rPr>
+      </w:pPr>
+      <w:r>
+        <w:rPr>
+          <w:rFonts w:ascii="Times New Roman" w:eastAsia="Times New Roman" w:hAnsi="Times New Roman"/>
           <w:sz w:val="28"/>
         </w:rPr>
         <w:t>1.  Hãy viết kịch bản gọi điện chốt sale cho SP/DV = [___] theo mô hình SPIN Selling, bao gồm xử lý 5 phản đối phổ biến.</w:t>
@@ -508,17 +539,18 @@
     </w:p>
     <w:p>
       <w:pPr>
-        <w:spacing/>
-        <w:ind w:left="620" w:hanging="360"/>
-        <w:rPr>
-          <w:rFonts w:ascii="Times New Roman" w:hAnsi="Times New Roman" w:cs="Times New Roman"/>
-          <w:sz w:val="28"/>
-          <w:szCs w:val="28"/>
-        </w:rPr>
-      </w:pPr>
-      <w:r>
-        <w:rPr>
-          <w:rFonts w:ascii="Times New Roman" w:hAnsi="Times New Roman" w:eastAsia="Times New Roman"/>
+        <w:spacing w:before="120" w:after="120" w:line="240" w:lineRule="auto"/>
+        <w:ind w:left="620" w:hanging="360"/>
+        <w:jc w:val="both"/>
+        <w:rPr>
+          <w:rFonts w:ascii="Times New Roman" w:hAnsi="Times New Roman" w:cs="Times New Roman"/>
+          <w:sz w:val="28"/>
+          <w:szCs w:val="28"/>
+        </w:rPr>
+      </w:pPr>
+      <w:r>
+        <w:rPr>
+          <w:rFonts w:ascii="Times New Roman" w:eastAsia="Times New Roman" w:hAnsi="Times New Roman"/>
           <w:sz w:val="28"/>
         </w:rPr>
         <w:t>2.  Soạn email bán hàng 200 từ cho SP/DV = [___], tạo cảm giác cấp bách và kêu gọi hành động rõ ràng.</w:t>
@@ -526,17 +558,18 @@
     </w:p>
     <w:p>
       <w:pPr>
-        <w:spacing/>
-        <w:ind w:left="620" w:hanging="360"/>
-        <w:rPr>
-          <w:rFonts w:ascii="Times New Roman" w:hAnsi="Times New Roman" w:cs="Times New Roman"/>
-          <w:sz w:val="28"/>
-          <w:szCs w:val="28"/>
-        </w:rPr>
-      </w:pPr>
-      <w:r>
-        <w:rPr>
-          <w:rFonts w:ascii="Times New Roman" w:hAnsi="Times New Roman" w:eastAsia="Times New Roman"/>
+        <w:spacing w:before="120" w:after="120" w:line="240" w:lineRule="auto"/>
+        <w:ind w:left="620" w:hanging="360"/>
+        <w:jc w:val="both"/>
+        <w:rPr>
+          <w:rFonts w:ascii="Times New Roman" w:hAnsi="Times New Roman" w:cs="Times New Roman"/>
+          <w:sz w:val="28"/>
+          <w:szCs w:val="28"/>
+        </w:rPr>
+      </w:pPr>
+      <w:r>
+        <w:rPr>
+          <w:rFonts w:ascii="Times New Roman" w:eastAsia="Times New Roman" w:hAnsi="Times New Roman"/>
           <w:sz w:val="28"/>
         </w:rPr>
         <w:t>3.  Viết kịch bản bán hàng trực tiếp (face-to-face) cho SP/DV = [___], trong đó khách hàng rất khó tính và liên tục nghi ngờ.</w:t>
@@ -544,17 +577,18 @@
     </w:p>
     <w:p>
       <w:pPr>
-        <w:spacing/>
-        <w:ind w:left="620" w:hanging="360"/>
-        <w:rPr>
-          <w:rFonts w:ascii="Times New Roman" w:hAnsi="Times New Roman" w:cs="Times New Roman"/>
-          <w:sz w:val="28"/>
-          <w:szCs w:val="28"/>
-        </w:rPr>
-      </w:pPr>
-      <w:r>
-        <w:rPr>
-          <w:rFonts w:ascii="Times New Roman" w:hAnsi="Times New Roman" w:eastAsia="Times New Roman"/>
+        <w:spacing w:before="120" w:after="120" w:line="240" w:lineRule="auto"/>
+        <w:ind w:left="620" w:hanging="360"/>
+        <w:jc w:val="both"/>
+        <w:rPr>
+          <w:rFonts w:ascii="Times New Roman" w:hAnsi="Times New Roman" w:cs="Times New Roman"/>
+          <w:sz w:val="28"/>
+          <w:szCs w:val="28"/>
+        </w:rPr>
+      </w:pPr>
+      <w:r>
+        <w:rPr>
+          <w:rFonts w:ascii="Times New Roman" w:eastAsia="Times New Roman" w:hAnsi="Times New Roman"/>
           <w:sz w:val="28"/>
         </w:rPr>
         <w:t>4.  Soạn đoạn hội thoại chatbot tư vấn khách hàng tiềm năng cho SP/DV = [___] trên website.</w:t>
@@ -562,17 +596,18 @@
     </w:p>
     <w:p>
       <w:pPr>
-        <w:spacing/>
-        <w:ind w:left="620" w:hanging="360"/>
-        <w:rPr>
-          <w:rFonts w:ascii="Times New Roman" w:hAnsi="Times New Roman" w:cs="Times New Roman"/>
-          <w:sz w:val="28"/>
-          <w:szCs w:val="28"/>
-        </w:rPr>
-      </w:pPr>
-      <w:r>
-        <w:rPr>
-          <w:rFonts w:ascii="Times New Roman" w:hAnsi="Times New Roman" w:eastAsia="Times New Roman"/>
+        <w:spacing w:before="120" w:after="120" w:line="240" w:lineRule="auto"/>
+        <w:ind w:left="620" w:hanging="360"/>
+        <w:jc w:val="both"/>
+        <w:rPr>
+          <w:rFonts w:ascii="Times New Roman" w:hAnsi="Times New Roman" w:cs="Times New Roman"/>
+          <w:sz w:val="28"/>
+          <w:szCs w:val="28"/>
+        </w:rPr>
+      </w:pPr>
+      <w:r>
+        <w:rPr>
+          <w:rFonts w:ascii="Times New Roman" w:eastAsia="Times New Roman" w:hAnsi="Times New Roman"/>
           <w:sz w:val="28"/>
         </w:rPr>
         <w:t>5.  Viết script livestream bán hàng SP/DV = [___] theo phong cách thân thiện, hài hước nhưng vẫn chốt đơn mạnh mẽ.</w:t>
@@ -580,17 +615,18 @@
     </w:p>
     <w:p>
       <w:pPr>
-        <w:spacing/>
-        <w:ind w:left="620" w:hanging="360"/>
-        <w:rPr>
-          <w:rFonts w:ascii="Times New Roman" w:hAnsi="Times New Roman" w:cs="Times New Roman"/>
-          <w:sz w:val="28"/>
-          <w:szCs w:val="28"/>
-        </w:rPr>
-      </w:pPr>
-      <w:r>
-        <w:rPr>
-          <w:rFonts w:ascii="Times New Roman" w:hAnsi="Times New Roman" w:eastAsia="Times New Roman"/>
+        <w:spacing w:before="120" w:after="120" w:line="240" w:lineRule="auto"/>
+        <w:ind w:left="620" w:hanging="360"/>
+        <w:jc w:val="both"/>
+        <w:rPr>
+          <w:rFonts w:ascii="Times New Roman" w:hAnsi="Times New Roman" w:cs="Times New Roman"/>
+          <w:sz w:val="28"/>
+          <w:szCs w:val="28"/>
+        </w:rPr>
+      </w:pPr>
+      <w:r>
+        <w:rPr>
+          <w:rFonts w:ascii="Times New Roman" w:eastAsia="Times New Roman" w:hAnsi="Times New Roman"/>
           <w:sz w:val="28"/>
         </w:rPr>
         <w:t>6.  Hãy đưa ra 10 câu hỏi bán hàng mở để khám phá nhu cầu khách hàng khi bán SP/DV = [___].</w:t>
@@ -598,17 +634,18 @@
     </w:p>
     <w:p>
       <w:pPr>
-        <w:spacing/>
-        <w:ind w:left="620" w:hanging="360"/>
-        <w:rPr>
-          <w:rFonts w:ascii="Times New Roman" w:hAnsi="Times New Roman" w:cs="Times New Roman"/>
-          <w:sz w:val="28"/>
-          <w:szCs w:val="28"/>
-        </w:rPr>
-      </w:pPr>
-      <w:r>
-        <w:rPr>
-          <w:rFonts w:ascii="Times New Roman" w:hAnsi="Times New Roman" w:eastAsia="Times New Roman"/>
+        <w:spacing w:before="120" w:after="120" w:line="240" w:lineRule="auto"/>
+        <w:ind w:left="620" w:hanging="360"/>
+        <w:jc w:val="both"/>
+        <w:rPr>
+          <w:rFonts w:ascii="Times New Roman" w:hAnsi="Times New Roman" w:cs="Times New Roman"/>
+          <w:sz w:val="28"/>
+          <w:szCs w:val="28"/>
+        </w:rPr>
+      </w:pPr>
+      <w:r>
+        <w:rPr>
+          <w:rFonts w:ascii="Times New Roman" w:eastAsia="Times New Roman" w:hAnsi="Times New Roman"/>
           <w:sz w:val="28"/>
         </w:rPr>
         <w:t>7.  Soạn kịch bản upsell &amp; cross-sell cho khách hàng đã mua SP/DV = [___], giúp tăng 30% giá trị đơn hàng.</w:t>
@@ -616,17 +653,18 @@
     </w:p>
     <w:p>
       <w:pPr>
-        <w:spacing/>
-        <w:ind w:left="620" w:hanging="360"/>
-        <w:rPr>
-          <w:rFonts w:ascii="Times New Roman" w:hAnsi="Times New Roman" w:cs="Times New Roman"/>
-          <w:sz w:val="28"/>
-          <w:szCs w:val="28"/>
-        </w:rPr>
-      </w:pPr>
-      <w:r>
-        <w:rPr>
-          <w:rFonts w:ascii="Times New Roman" w:hAnsi="Times New Roman" w:eastAsia="Times New Roman"/>
+        <w:spacing w:before="120" w:after="120" w:line="240" w:lineRule="auto"/>
+        <w:ind w:left="620" w:hanging="360"/>
+        <w:jc w:val="both"/>
+        <w:rPr>
+          <w:rFonts w:ascii="Times New Roman" w:hAnsi="Times New Roman" w:cs="Times New Roman"/>
+          <w:sz w:val="28"/>
+          <w:szCs w:val="28"/>
+        </w:rPr>
+      </w:pPr>
+      <w:r>
+        <w:rPr>
+          <w:rFonts w:ascii="Times New Roman" w:eastAsia="Times New Roman" w:hAnsi="Times New Roman"/>
           <w:sz w:val="28"/>
         </w:rPr>
         <w:t>8.  Viết mẫu tin nhắn follow-up sau 3 ngày khách hàng chưa phản hồi về SP/DV = [___], vừa nhắc khéo vừa tạo hứng thú.</w:t>
@@ -634,17 +672,18 @@
     </w:p>
     <w:p>
       <w:pPr>
-        <w:spacing/>
-        <w:ind w:left="620" w:hanging="360"/>
-        <w:rPr>
-          <w:rFonts w:ascii="Times New Roman" w:hAnsi="Times New Roman" w:cs="Times New Roman"/>
-          <w:sz w:val="28"/>
-          <w:szCs w:val="28"/>
-        </w:rPr>
-      </w:pPr>
-      <w:r>
-        <w:rPr>
-          <w:rFonts w:ascii="Times New Roman" w:hAnsi="Times New Roman" w:eastAsia="Times New Roman"/>
+        <w:spacing w:before="120" w:after="120" w:line="240" w:lineRule="auto"/>
+        <w:ind w:left="620" w:hanging="360"/>
+        <w:jc w:val="both"/>
+        <w:rPr>
+          <w:rFonts w:ascii="Times New Roman" w:hAnsi="Times New Roman" w:cs="Times New Roman"/>
+          <w:sz w:val="28"/>
+          <w:szCs w:val="28"/>
+        </w:rPr>
+      </w:pPr>
+      <w:r>
+        <w:rPr>
+          <w:rFonts w:ascii="Times New Roman" w:eastAsia="Times New Roman" w:hAnsi="Times New Roman"/>
           <w:sz w:val="28"/>
         </w:rPr>
         <w:t>9.  Tạo bảng phân loại khách hàng tiềm năng (nóng – ấm – lạnh) cho SP/DV = [___], kèm chiến lược chốt sale riêng cho từng nhóm.</w:t>
@@ -652,17 +691,18 @@
     </w:p>
     <w:p>
       <w:pPr>
-        <w:spacing/>
-        <w:ind w:left="620" w:hanging="360"/>
-        <w:rPr>
-          <w:rFonts w:ascii="Times New Roman" w:hAnsi="Times New Roman" w:cs="Times New Roman"/>
-          <w:sz w:val="28"/>
-          <w:szCs w:val="28"/>
-        </w:rPr>
-      </w:pPr>
-      <w:r>
-        <w:rPr>
-          <w:rFonts w:ascii="Times New Roman" w:hAnsi="Times New Roman" w:eastAsia="Times New Roman"/>
+        <w:spacing w:before="120" w:after="120" w:line="240" w:lineRule="auto"/>
+        <w:ind w:left="620" w:hanging="360"/>
+        <w:jc w:val="both"/>
+        <w:rPr>
+          <w:rFonts w:ascii="Times New Roman" w:hAnsi="Times New Roman" w:cs="Times New Roman"/>
+          <w:sz w:val="28"/>
+          <w:szCs w:val="28"/>
+        </w:rPr>
+      </w:pPr>
+      <w:r>
+        <w:rPr>
+          <w:rFonts w:ascii="Times New Roman" w:eastAsia="Times New Roman" w:hAnsi="Times New Roman"/>
           <w:sz w:val="28"/>
         </w:rPr>
         <w:t>10.Viết kịch bản bán hàng cấp cao (High-ticket Sales) cho SP/DV = [___] với giá trị hợp đồng trên $20.000.</w:t>
@@ -670,9 +710,8 @@
     </w:p>
     <w:p>
       <w:pPr>
-        <w:keepNext w:val="0"/>
-        <w:keepLines w:val="0"/>
-        <w:spacing/>
+        <w:spacing w:before="120" w:after="120" w:line="240" w:lineRule="auto"/>
+        <w:jc w:val="both"/>
         <w:rPr>
           <w:rFonts w:ascii="Times New Roman" w:hAnsi="Times New Roman" w:cs="Times New Roman"/>
           <w:b/>
@@ -683,7 +722,7 @@
       </w:pPr>
       <w:r>
         <w:rPr>
-          <w:rFonts w:ascii="Times New Roman" w:hAnsi="Times New Roman" w:eastAsia="Times New Roman"/>
+          <w:rFonts w:ascii="Times New Roman" w:eastAsia="Times New Roman" w:hAnsi="Times New Roman"/>
           <w:b/>
           <w:sz w:val="28"/>
         </w:rPr>
@@ -692,17 +731,18 @@
     </w:p>
     <w:p>
       <w:pPr>
-        <w:spacing/>
-        <w:ind w:left="620" w:hanging="360"/>
-        <w:rPr>
-          <w:rFonts w:ascii="Times New Roman" w:hAnsi="Times New Roman" w:cs="Times New Roman"/>
-          <w:sz w:val="28"/>
-          <w:szCs w:val="28"/>
-        </w:rPr>
-      </w:pPr>
-      <w:r>
-        <w:rPr>
-          <w:rFonts w:ascii="Times New Roman" w:hAnsi="Times New Roman" w:eastAsia="Times New Roman"/>
+        <w:spacing w:before="120" w:after="120" w:line="240" w:lineRule="auto"/>
+        <w:ind w:left="620" w:hanging="360"/>
+        <w:jc w:val="both"/>
+        <w:rPr>
+          <w:rFonts w:ascii="Times New Roman" w:hAnsi="Times New Roman" w:cs="Times New Roman"/>
+          <w:sz w:val="28"/>
+          <w:szCs w:val="28"/>
+        </w:rPr>
+      </w:pPr>
+      <w:r>
+        <w:rPr>
+          <w:rFonts w:ascii="Times New Roman" w:eastAsia="Times New Roman" w:hAnsi="Times New Roman"/>
           <w:sz w:val="28"/>
         </w:rPr>
         <w:t>1.  Lập kế hoạch quảng cáo Facebook cho SP/DV = [___] trong 30 ngày, bao gồm target, nội dung, ngân sách và KPI.</w:t>
@@ -710,17 +750,18 @@
     </w:p>
     <w:p>
       <w:pPr>
-        <w:spacing/>
-        <w:ind w:left="620" w:hanging="360"/>
-        <w:rPr>
-          <w:rFonts w:ascii="Times New Roman" w:hAnsi="Times New Roman" w:cs="Times New Roman"/>
-          <w:sz w:val="28"/>
-          <w:szCs w:val="28"/>
-        </w:rPr>
-      </w:pPr>
-      <w:r>
-        <w:rPr>
-          <w:rFonts w:ascii="Times New Roman" w:hAnsi="Times New Roman" w:eastAsia="Times New Roman"/>
+        <w:spacing w:before="120" w:after="120" w:line="240" w:lineRule="auto"/>
+        <w:ind w:left="620" w:hanging="360"/>
+        <w:jc w:val="both"/>
+        <w:rPr>
+          <w:rFonts w:ascii="Times New Roman" w:hAnsi="Times New Roman" w:cs="Times New Roman"/>
+          <w:sz w:val="28"/>
+          <w:szCs w:val="28"/>
+        </w:rPr>
+      </w:pPr>
+      <w:r>
+        <w:rPr>
+          <w:rFonts w:ascii="Times New Roman" w:eastAsia="Times New Roman" w:hAnsi="Times New Roman"/>
           <w:sz w:val="28"/>
         </w:rPr>
         <w:t>2.  Viết kịch bản video TikTok 30 giây để quảng bá SP/DV = [___], phong cách vui nhộn và viral.</w:t>
@@ -728,17 +769,18 @@
     </w:p>
     <w:p>
       <w:pPr>
-        <w:spacing/>
-        <w:ind w:left="620" w:hanging="360"/>
-        <w:rPr>
-          <w:rFonts w:ascii="Times New Roman" w:hAnsi="Times New Roman" w:cs="Times New Roman"/>
-          <w:sz w:val="28"/>
-          <w:szCs w:val="28"/>
-        </w:rPr>
-      </w:pPr>
-      <w:r>
-        <w:rPr>
-          <w:rFonts w:ascii="Times New Roman" w:hAnsi="Times New Roman" w:eastAsia="Times New Roman"/>
+        <w:spacing w:before="120" w:after="120" w:line="240" w:lineRule="auto"/>
+        <w:ind w:left="620" w:hanging="360"/>
+        <w:jc w:val="both"/>
+        <w:rPr>
+          <w:rFonts w:ascii="Times New Roman" w:hAnsi="Times New Roman" w:cs="Times New Roman"/>
+          <w:sz w:val="28"/>
+          <w:szCs w:val="28"/>
+        </w:rPr>
+      </w:pPr>
+      <w:r>
+        <w:rPr>
+          <w:rFonts w:ascii="Times New Roman" w:eastAsia="Times New Roman" w:hAnsi="Times New Roman"/>
           <w:sz w:val="28"/>
         </w:rPr>
         <w:t>3.  Soạn kế hoạch email marketing 5 bước nuôi dưỡng khách hàng tiềm năng của SP/DV = [___].</w:t>
@@ -746,35 +788,38 @@
     </w:p>
     <w:p>
       <w:pPr>
-        <w:spacing/>
-        <w:ind w:left="620" w:hanging="360"/>
-        <w:rPr>
-          <w:rFonts w:ascii="Times New Roman" w:hAnsi="Times New Roman" w:cs="Times New Roman"/>
-          <w:sz w:val="28"/>
-          <w:szCs w:val="28"/>
-        </w:rPr>
-      </w:pPr>
-      <w:r>
-        <w:rPr>
-          <w:rFonts w:ascii="Times New Roman" w:hAnsi="Times New Roman" w:eastAsia="Times New Roman"/>
-          <w:sz w:val="28"/>
-        </w:rPr>
+        <w:spacing w:before="120" w:after="120" w:line="240" w:lineRule="auto"/>
+        <w:ind w:left="620" w:hanging="360"/>
+        <w:jc w:val="both"/>
+        <w:rPr>
+          <w:rFonts w:ascii="Times New Roman" w:hAnsi="Times New Roman" w:cs="Times New Roman"/>
+          <w:sz w:val="28"/>
+          <w:szCs w:val="28"/>
+        </w:rPr>
+      </w:pPr>
+      <w:r>
+        <w:rPr>
+          <w:rFonts w:ascii="Times New Roman" w:eastAsia="Times New Roman" w:hAnsi="Times New Roman"/>
+          <w:sz w:val="28"/>
+        </w:rPr>
+        <w:lastRenderedPageBreak/>
         <w:t>4.  Tạo lịch đăng nội dung 30 ngày trên fanpage cho SP/DV = [___], gồm 5 dạng content chính.</w:t>
       </w:r>
     </w:p>
     <w:p>
       <w:pPr>
-        <w:spacing/>
-        <w:ind w:left="620" w:hanging="360"/>
-        <w:rPr>
-          <w:rFonts w:ascii="Times New Roman" w:hAnsi="Times New Roman" w:cs="Times New Roman"/>
-          <w:sz w:val="28"/>
-          <w:szCs w:val="28"/>
-        </w:rPr>
-      </w:pPr>
-      <w:r>
-        <w:rPr>
-          <w:rFonts w:ascii="Times New Roman" w:hAnsi="Times New Roman" w:eastAsia="Times New Roman"/>
+        <w:spacing w:before="120" w:after="120" w:line="240" w:lineRule="auto"/>
+        <w:ind w:left="620" w:hanging="360"/>
+        <w:jc w:val="both"/>
+        <w:rPr>
+          <w:rFonts w:ascii="Times New Roman" w:hAnsi="Times New Roman" w:cs="Times New Roman"/>
+          <w:sz w:val="28"/>
+          <w:szCs w:val="28"/>
+        </w:rPr>
+      </w:pPr>
+      <w:r>
+        <w:rPr>
+          <w:rFonts w:ascii="Times New Roman" w:eastAsia="Times New Roman" w:hAnsi="Times New Roman"/>
           <w:sz w:val="28"/>
         </w:rPr>
         <w:t>5.  Hãy lập kế hoạch SEO cho website bán SP/DV = [___], tập trung vào từ khóa dài và chiến lược content.</w:t>
@@ -782,17 +827,18 @@
     </w:p>
     <w:p>
       <w:pPr>
-        <w:spacing/>
-        <w:ind w:left="620" w:hanging="360"/>
-        <w:rPr>
-          <w:rFonts w:ascii="Times New Roman" w:hAnsi="Times New Roman" w:cs="Times New Roman"/>
-          <w:sz w:val="28"/>
-          <w:szCs w:val="28"/>
-        </w:rPr>
-      </w:pPr>
-      <w:r>
-        <w:rPr>
-          <w:rFonts w:ascii="Times New Roman" w:hAnsi="Times New Roman" w:eastAsia="Times New Roman"/>
+        <w:spacing w:before="120" w:after="120" w:line="240" w:lineRule="auto"/>
+        <w:ind w:left="620" w:hanging="360"/>
+        <w:jc w:val="both"/>
+        <w:rPr>
+          <w:rFonts w:ascii="Times New Roman" w:hAnsi="Times New Roman" w:cs="Times New Roman"/>
+          <w:sz w:val="28"/>
+          <w:szCs w:val="28"/>
+        </w:rPr>
+      </w:pPr>
+      <w:r>
+        <w:rPr>
+          <w:rFonts w:ascii="Times New Roman" w:eastAsia="Times New Roman" w:hAnsi="Times New Roman"/>
           <w:sz w:val="28"/>
         </w:rPr>
         <w:t>6.  Đưa ra chiến lược influencer marketing để quảng bá SP/DV = [___], gồm tiêu chí chọn KOL và cách đo lường hiệu quả.</w:t>
@@ -800,17 +846,18 @@
     </w:p>
     <w:p>
       <w:pPr>
-        <w:spacing/>
-        <w:ind w:left="620" w:hanging="360"/>
-        <w:rPr>
-          <w:rFonts w:ascii="Times New Roman" w:hAnsi="Times New Roman" w:cs="Times New Roman"/>
-          <w:sz w:val="28"/>
-          <w:szCs w:val="28"/>
-        </w:rPr>
-      </w:pPr>
-      <w:r>
-        <w:rPr>
-          <w:rFonts w:ascii="Times New Roman" w:hAnsi="Times New Roman" w:eastAsia="Times New Roman"/>
+        <w:spacing w:before="120" w:after="120" w:line="240" w:lineRule="auto"/>
+        <w:ind w:left="620" w:hanging="360"/>
+        <w:jc w:val="both"/>
+        <w:rPr>
+          <w:rFonts w:ascii="Times New Roman" w:hAnsi="Times New Roman" w:cs="Times New Roman"/>
+          <w:sz w:val="28"/>
+          <w:szCs w:val="28"/>
+        </w:rPr>
+      </w:pPr>
+      <w:r>
+        <w:rPr>
+          <w:rFonts w:ascii="Times New Roman" w:eastAsia="Times New Roman" w:hAnsi="Times New Roman"/>
           <w:sz w:val="28"/>
         </w:rPr>
         <w:t>7.  Viết kịch bản quảng cáo YouTube cho SP/DV = [___] với độ dài 60 giây.</w:t>
@@ -818,17 +865,18 @@
     </w:p>
     <w:p>
       <w:pPr>
-        <w:spacing/>
-        <w:ind w:left="620" w:hanging="360"/>
-        <w:rPr>
-          <w:rFonts w:ascii="Times New Roman" w:hAnsi="Times New Roman" w:cs="Times New Roman"/>
-          <w:sz w:val="28"/>
-          <w:szCs w:val="28"/>
-        </w:rPr>
-      </w:pPr>
-      <w:r>
-        <w:rPr>
-          <w:rFonts w:ascii="Times New Roman" w:hAnsi="Times New Roman" w:eastAsia="Times New Roman"/>
+        <w:spacing w:before="120" w:after="120" w:line="240" w:lineRule="auto"/>
+        <w:ind w:left="620" w:hanging="360"/>
+        <w:jc w:val="both"/>
+        <w:rPr>
+          <w:rFonts w:ascii="Times New Roman" w:hAnsi="Times New Roman" w:cs="Times New Roman"/>
+          <w:sz w:val="28"/>
+          <w:szCs w:val="28"/>
+        </w:rPr>
+      </w:pPr>
+      <w:r>
+        <w:rPr>
+          <w:rFonts w:ascii="Times New Roman" w:eastAsia="Times New Roman" w:hAnsi="Times New Roman"/>
           <w:sz w:val="28"/>
         </w:rPr>
         <w:t>8.  Soạn kế hoạch remarketing cho khách hàng từng ghé website nhưng chưa mua SP/DV = [___].</w:t>
@@ -836,17 +884,18 @@
     </w:p>
     <w:p>
       <w:pPr>
-        <w:spacing/>
-        <w:ind w:left="620" w:hanging="360"/>
-        <w:rPr>
-          <w:rFonts w:ascii="Times New Roman" w:hAnsi="Times New Roman" w:cs="Times New Roman"/>
-          <w:sz w:val="28"/>
-          <w:szCs w:val="28"/>
-        </w:rPr>
-      </w:pPr>
-      <w:r>
-        <w:rPr>
-          <w:rFonts w:ascii="Times New Roman" w:hAnsi="Times New Roman" w:eastAsia="Times New Roman"/>
+        <w:spacing w:before="120" w:after="120" w:line="240" w:lineRule="auto"/>
+        <w:ind w:left="620" w:hanging="360"/>
+        <w:jc w:val="both"/>
+        <w:rPr>
+          <w:rFonts w:ascii="Times New Roman" w:hAnsi="Times New Roman" w:cs="Times New Roman"/>
+          <w:sz w:val="28"/>
+          <w:szCs w:val="28"/>
+        </w:rPr>
+      </w:pPr>
+      <w:r>
+        <w:rPr>
+          <w:rFonts w:ascii="Times New Roman" w:eastAsia="Times New Roman" w:hAnsi="Times New Roman"/>
           <w:sz w:val="28"/>
         </w:rPr>
         <w:t>9.  Hãy thiết kế chiến dịch marketing 360° cho SP/DV = [___], kết hợp cả online và offline.</w:t>
@@ -854,17 +903,18 @@
     </w:p>
     <w:p>
       <w:pPr>
-        <w:spacing/>
-        <w:ind w:left="620" w:hanging="360"/>
-        <w:rPr>
-          <w:rFonts w:ascii="Times New Roman" w:hAnsi="Times New Roman" w:cs="Times New Roman"/>
-          <w:sz w:val="28"/>
-          <w:szCs w:val="28"/>
-        </w:rPr>
-      </w:pPr>
-      <w:r>
-        <w:rPr>
-          <w:rFonts w:ascii="Times New Roman" w:hAnsi="Times New Roman" w:eastAsia="Times New Roman"/>
+        <w:spacing w:before="120" w:after="120" w:line="240" w:lineRule="auto"/>
+        <w:ind w:left="620" w:hanging="360"/>
+        <w:jc w:val="both"/>
+        <w:rPr>
+          <w:rFonts w:ascii="Times New Roman" w:hAnsi="Times New Roman" w:cs="Times New Roman"/>
+          <w:sz w:val="28"/>
+          <w:szCs w:val="28"/>
+        </w:rPr>
+      </w:pPr>
+      <w:r>
+        <w:rPr>
+          <w:rFonts w:ascii="Times New Roman" w:eastAsia="Times New Roman" w:hAnsi="Times New Roman"/>
           <w:sz w:val="28"/>
         </w:rPr>
         <w:t>10.Tạo khung kịch bản PR báo chí cho SP/DV = [___], gồm 3 góc câu chuyện khác nhau để thu hút truyền thông.</w:t>
@@ -872,9 +922,8 @@
     </w:p>
     <w:p>
       <w:pPr>
-        <w:keepNext w:val="0"/>
-        <w:keepLines w:val="0"/>
-        <w:spacing/>
+        <w:spacing w:before="120" w:after="120" w:line="240" w:lineRule="auto"/>
+        <w:jc w:val="both"/>
         <w:rPr>
           <w:rFonts w:ascii="Times New Roman" w:hAnsi="Times New Roman" w:cs="Times New Roman"/>
           <w:b/>
@@ -885,7 +934,7 @@
       </w:pPr>
       <w:r>
         <w:rPr>
-          <w:rFonts w:ascii="Times New Roman" w:hAnsi="Times New Roman" w:eastAsia="Times New Roman"/>
+          <w:rFonts w:ascii="Times New Roman" w:eastAsia="Times New Roman" w:hAnsi="Times New Roman"/>
           <w:b/>
           <w:sz w:val="28"/>
         </w:rPr>
@@ -894,17 +943,18 @@
     </w:p>
     <w:p>
       <w:pPr>
-        <w:spacing/>
-        <w:ind w:left="620" w:hanging="360"/>
-        <w:rPr>
-          <w:rFonts w:ascii="Times New Roman" w:hAnsi="Times New Roman" w:cs="Times New Roman"/>
-          <w:sz w:val="28"/>
-          <w:szCs w:val="28"/>
-        </w:rPr>
-      </w:pPr>
-      <w:r>
-        <w:rPr>
-          <w:rFonts w:ascii="Times New Roman" w:hAnsi="Times New Roman" w:eastAsia="Times New Roman"/>
+        <w:spacing w:before="120" w:after="120" w:line="240" w:lineRule="auto"/>
+        <w:ind w:left="620" w:hanging="360"/>
+        <w:jc w:val="both"/>
+        <w:rPr>
+          <w:rFonts w:ascii="Times New Roman" w:hAnsi="Times New Roman" w:cs="Times New Roman"/>
+          <w:sz w:val="28"/>
+          <w:szCs w:val="28"/>
+        </w:rPr>
+      </w:pPr>
+      <w:r>
+        <w:rPr>
+          <w:rFonts w:ascii="Times New Roman" w:eastAsia="Times New Roman" w:hAnsi="Times New Roman"/>
           <w:sz w:val="28"/>
         </w:rPr>
         <w:t>1.  Hãy vào vai chuyên gia đàm phán quốc tế, soạn chiến lược thương lượng win-win để ký hợp đồng giá trị lớn liên quan đến SP/DV = [___], đưa ra 3 kịch bản đối tác ép giá và cách phản ứng khéo léo.</w:t>
@@ -912,17 +962,18 @@
     </w:p>
     <w:p>
       <w:pPr>
-        <w:spacing/>
-        <w:ind w:left="620" w:hanging="360"/>
-        <w:rPr>
-          <w:rFonts w:ascii="Times New Roman" w:hAnsi="Times New Roman" w:cs="Times New Roman"/>
-          <w:sz w:val="28"/>
-          <w:szCs w:val="28"/>
-        </w:rPr>
-      </w:pPr>
-      <w:r>
-        <w:rPr>
-          <w:rFonts w:ascii="Times New Roman" w:hAnsi="Times New Roman" w:eastAsia="Times New Roman"/>
+        <w:spacing w:before="120" w:after="120" w:line="240" w:lineRule="auto"/>
+        <w:ind w:left="620" w:hanging="360"/>
+        <w:jc w:val="both"/>
+        <w:rPr>
+          <w:rFonts w:ascii="Times New Roman" w:hAnsi="Times New Roman" w:cs="Times New Roman"/>
+          <w:sz w:val="28"/>
+          <w:szCs w:val="28"/>
+        </w:rPr>
+      </w:pPr>
+      <w:r>
+        <w:rPr>
+          <w:rFonts w:ascii="Times New Roman" w:eastAsia="Times New Roman" w:hAnsi="Times New Roman"/>
           <w:sz w:val="28"/>
         </w:rPr>
         <w:t>2.  Viết kịch bản thương lượng với nhà cung cấp để giảm 20% chi phí nhập hàng cho SP/DV = [___], nhưng vẫn duy trì quan hệ hợp tác lâu dài.</w:t>
@@ -930,17 +981,18 @@
     </w:p>
     <w:p>
       <w:pPr>
-        <w:spacing/>
-        <w:ind w:left="620" w:hanging="360"/>
-        <w:rPr>
-          <w:rFonts w:ascii="Times New Roman" w:hAnsi="Times New Roman" w:cs="Times New Roman"/>
-          <w:sz w:val="28"/>
-          <w:szCs w:val="28"/>
-        </w:rPr>
-      </w:pPr>
-      <w:r>
-        <w:rPr>
-          <w:rFonts w:ascii="Times New Roman" w:hAnsi="Times New Roman" w:eastAsia="Times New Roman"/>
+        <w:spacing w:before="120" w:after="120" w:line="240" w:lineRule="auto"/>
+        <w:ind w:left="620" w:hanging="360"/>
+        <w:jc w:val="both"/>
+        <w:rPr>
+          <w:rFonts w:ascii="Times New Roman" w:hAnsi="Times New Roman" w:cs="Times New Roman"/>
+          <w:sz w:val="28"/>
+          <w:szCs w:val="28"/>
+        </w:rPr>
+      </w:pPr>
+      <w:r>
+        <w:rPr>
+          <w:rFonts w:ascii="Times New Roman" w:eastAsia="Times New Roman" w:hAnsi="Times New Roman"/>
           <w:sz w:val="28"/>
         </w:rPr>
         <w:t>3.  Tạo checklist 10 bước chuẩn bị trước khi bước vào bàn đàm phán về SP/DV = [___].</w:t>
@@ -948,17 +1000,18 @@
     </w:p>
     <w:p>
       <w:pPr>
-        <w:spacing/>
-        <w:ind w:left="620" w:hanging="360"/>
-        <w:rPr>
-          <w:rFonts w:ascii="Times New Roman" w:hAnsi="Times New Roman" w:cs="Times New Roman"/>
-          <w:sz w:val="28"/>
-          <w:szCs w:val="28"/>
-        </w:rPr>
-      </w:pPr>
-      <w:r>
-        <w:rPr>
-          <w:rFonts w:ascii="Times New Roman" w:hAnsi="Times New Roman" w:eastAsia="Times New Roman"/>
+        <w:spacing w:before="120" w:after="120" w:line="240" w:lineRule="auto"/>
+        <w:ind w:left="620" w:hanging="360"/>
+        <w:jc w:val="both"/>
+        <w:rPr>
+          <w:rFonts w:ascii="Times New Roman" w:hAnsi="Times New Roman" w:cs="Times New Roman"/>
+          <w:sz w:val="28"/>
+          <w:szCs w:val="28"/>
+        </w:rPr>
+      </w:pPr>
+      <w:r>
+        <w:rPr>
+          <w:rFonts w:ascii="Times New Roman" w:eastAsia="Times New Roman" w:hAnsi="Times New Roman"/>
           <w:sz w:val="28"/>
         </w:rPr>
         <w:t>4.  Soạn chiến lược đàm phán khi khách hàng yêu cầu bảo hành quá dài cho SP/DV = [___], vừa bảo vệ lợi ích doanh nghiệp vừa giữ được uy tín.</w:t>
@@ -966,17 +1019,18 @@
     </w:p>
     <w:p>
       <w:pPr>
-        <w:spacing/>
-        <w:ind w:left="620" w:hanging="360"/>
-        <w:rPr>
-          <w:rFonts w:ascii="Times New Roman" w:hAnsi="Times New Roman" w:cs="Times New Roman"/>
-          <w:sz w:val="28"/>
-          <w:szCs w:val="28"/>
-        </w:rPr>
-      </w:pPr>
-      <w:r>
-        <w:rPr>
-          <w:rFonts w:ascii="Times New Roman" w:hAnsi="Times New Roman" w:eastAsia="Times New Roman"/>
+        <w:spacing w:before="120" w:after="120" w:line="240" w:lineRule="auto"/>
+        <w:ind w:left="620" w:hanging="360"/>
+        <w:jc w:val="both"/>
+        <w:rPr>
+          <w:rFonts w:ascii="Times New Roman" w:hAnsi="Times New Roman" w:cs="Times New Roman"/>
+          <w:sz w:val="28"/>
+          <w:szCs w:val="28"/>
+        </w:rPr>
+      </w:pPr>
+      <w:r>
+        <w:rPr>
+          <w:rFonts w:ascii="Times New Roman" w:eastAsia="Times New Roman" w:hAnsi="Times New Roman"/>
           <w:sz w:val="28"/>
         </w:rPr>
         <w:t>5.  Hãy viết đoạn hội thoại thương lượng hợp đồng dịch vụ với khách hàng khó tính về SP/DV = [___].</w:t>
@@ -984,17 +1038,18 @@
     </w:p>
     <w:p>
       <w:pPr>
-        <w:spacing/>
-        <w:ind w:left="620" w:hanging="360"/>
-        <w:rPr>
-          <w:rFonts w:ascii="Times New Roman" w:hAnsi="Times New Roman" w:cs="Times New Roman"/>
-          <w:sz w:val="28"/>
-          <w:szCs w:val="28"/>
-        </w:rPr>
-      </w:pPr>
-      <w:r>
-        <w:rPr>
-          <w:rFonts w:ascii="Times New Roman" w:hAnsi="Times New Roman" w:eastAsia="Times New Roman"/>
+        <w:spacing w:before="120" w:after="120" w:line="240" w:lineRule="auto"/>
+        <w:ind w:left="620" w:hanging="360"/>
+        <w:jc w:val="both"/>
+        <w:rPr>
+          <w:rFonts w:ascii="Times New Roman" w:hAnsi="Times New Roman" w:cs="Times New Roman"/>
+          <w:sz w:val="28"/>
+          <w:szCs w:val="28"/>
+        </w:rPr>
+      </w:pPr>
+      <w:r>
+        <w:rPr>
+          <w:rFonts w:ascii="Times New Roman" w:eastAsia="Times New Roman" w:hAnsi="Times New Roman"/>
           <w:sz w:val="28"/>
         </w:rPr>
         <w:t>6.  Tạo kịch bản thương lượng giá trị đầu tư với nhà đầu tư thiên thần cho startup cung cấp SP/DV = [___].</w:t>
@@ -1002,17 +1057,18 @@
     </w:p>
     <w:p>
       <w:pPr>
-        <w:spacing/>
-        <w:ind w:left="620" w:hanging="360"/>
-        <w:rPr>
-          <w:rFonts w:ascii="Times New Roman" w:hAnsi="Times New Roman" w:cs="Times New Roman"/>
-          <w:sz w:val="28"/>
-          <w:szCs w:val="28"/>
-        </w:rPr>
-      </w:pPr>
-      <w:r>
-        <w:rPr>
-          <w:rFonts w:ascii="Times New Roman" w:hAnsi="Times New Roman" w:eastAsia="Times New Roman"/>
+        <w:spacing w:before="120" w:after="120" w:line="240" w:lineRule="auto"/>
+        <w:ind w:left="620" w:hanging="360"/>
+        <w:jc w:val="both"/>
+        <w:rPr>
+          <w:rFonts w:ascii="Times New Roman" w:hAnsi="Times New Roman" w:cs="Times New Roman"/>
+          <w:sz w:val="28"/>
+          <w:szCs w:val="28"/>
+        </w:rPr>
+      </w:pPr>
+      <w:r>
+        <w:rPr>
+          <w:rFonts w:ascii="Times New Roman" w:eastAsia="Times New Roman" w:hAnsi="Times New Roman"/>
           <w:sz w:val="28"/>
         </w:rPr>
         <w:t>7.  Hãy viết chiến lược đàm phán phân chia lợi nhuận trong liên doanh SP/DV = [___], bảo đảm công bằng và minh bạch.</w:t>
@@ -1020,17 +1076,18 @@
     </w:p>
     <w:p>
       <w:pPr>
-        <w:spacing/>
-        <w:ind w:left="620" w:hanging="360"/>
-        <w:rPr>
-          <w:rFonts w:ascii="Times New Roman" w:hAnsi="Times New Roman" w:cs="Times New Roman"/>
-          <w:sz w:val="28"/>
-          <w:szCs w:val="28"/>
-        </w:rPr>
-      </w:pPr>
-      <w:r>
-        <w:rPr>
-          <w:rFonts w:ascii="Times New Roman" w:hAnsi="Times New Roman" w:eastAsia="Times New Roman"/>
+        <w:spacing w:before="120" w:after="120" w:line="240" w:lineRule="auto"/>
+        <w:ind w:left="620" w:hanging="360"/>
+        <w:jc w:val="both"/>
+        <w:rPr>
+          <w:rFonts w:ascii="Times New Roman" w:hAnsi="Times New Roman" w:cs="Times New Roman"/>
+          <w:sz w:val="28"/>
+          <w:szCs w:val="28"/>
+        </w:rPr>
+      </w:pPr>
+      <w:r>
+        <w:rPr>
+          <w:rFonts w:ascii="Times New Roman" w:eastAsia="Times New Roman" w:hAnsi="Times New Roman"/>
           <w:sz w:val="28"/>
         </w:rPr>
         <w:t>8.  Đề xuất cách xử lý khi khách hàng cố tình so sánh giá SP/DV = [___] với đối thủ rẻ hơn.</w:t>
@@ -1038,17 +1095,18 @@
     </w:p>
     <w:p>
       <w:pPr>
-        <w:spacing/>
-        <w:ind w:left="620" w:hanging="360"/>
-        <w:rPr>
-          <w:rFonts w:ascii="Times New Roman" w:hAnsi="Times New Roman" w:cs="Times New Roman"/>
-          <w:sz w:val="28"/>
-          <w:szCs w:val="28"/>
-        </w:rPr>
-      </w:pPr>
-      <w:r>
-        <w:rPr>
-          <w:rFonts w:ascii="Times New Roman" w:hAnsi="Times New Roman" w:eastAsia="Times New Roman"/>
+        <w:spacing w:before="120" w:after="120" w:line="240" w:lineRule="auto"/>
+        <w:ind w:left="620" w:hanging="360"/>
+        <w:jc w:val="both"/>
+        <w:rPr>
+          <w:rFonts w:ascii="Times New Roman" w:hAnsi="Times New Roman" w:cs="Times New Roman"/>
+          <w:sz w:val="28"/>
+          <w:szCs w:val="28"/>
+        </w:rPr>
+      </w:pPr>
+      <w:r>
+        <w:rPr>
+          <w:rFonts w:ascii="Times New Roman" w:eastAsia="Times New Roman" w:hAnsi="Times New Roman"/>
           <w:sz w:val="28"/>
         </w:rPr>
         <w:t>9.  Viết chiến thuật đàm phán hợp đồng quốc tế khi bán SP/DV = [___] sang thị trường Mỹ.</w:t>
@@ -1056,17 +1114,18 @@
     </w:p>
     <w:p>
       <w:pPr>
-        <w:spacing/>
-        <w:ind w:left="620" w:hanging="360"/>
-        <w:rPr>
-          <w:rFonts w:ascii="Times New Roman" w:hAnsi="Times New Roman" w:cs="Times New Roman"/>
-          <w:sz w:val="28"/>
-          <w:szCs w:val="28"/>
-        </w:rPr>
-      </w:pPr>
-      <w:r>
-        <w:rPr>
-          <w:rFonts w:ascii="Times New Roman" w:hAnsi="Times New Roman" w:eastAsia="Times New Roman"/>
+        <w:spacing w:before="120" w:after="120" w:line="240" w:lineRule="auto"/>
+        <w:ind w:left="620" w:hanging="360"/>
+        <w:jc w:val="both"/>
+        <w:rPr>
+          <w:rFonts w:ascii="Times New Roman" w:hAnsi="Times New Roman" w:cs="Times New Roman"/>
+          <w:sz w:val="28"/>
+          <w:szCs w:val="28"/>
+        </w:rPr>
+      </w:pPr>
+      <w:r>
+        <w:rPr>
+          <w:rFonts w:ascii="Times New Roman" w:eastAsia="Times New Roman" w:hAnsi="Times New Roman"/>
           <w:sz w:val="28"/>
         </w:rPr>
         <w:t>10.Soạn 5 kịch bản thương lượng win-win khi khách hàng liên tục trì hoãn việc ký hợp đồng mua SP/DV = [___].</w:t>
@@ -1074,9 +1133,8 @@
     </w:p>
     <w:p>
       <w:pPr>
-        <w:keepNext w:val="0"/>
-        <w:keepLines w:val="0"/>
-        <w:spacing/>
+        <w:spacing w:before="120" w:after="120" w:line="240" w:lineRule="auto"/>
+        <w:jc w:val="both"/>
         <w:rPr>
           <w:rFonts w:ascii="Times New Roman" w:hAnsi="Times New Roman" w:cs="Times New Roman"/>
           <w:b/>
@@ -1087,7 +1145,7 @@
       </w:pPr>
       <w:r>
         <w:rPr>
-          <w:rFonts w:ascii="Times New Roman" w:hAnsi="Times New Roman" w:eastAsia="Times New Roman"/>
+          <w:rFonts w:ascii="Times New Roman" w:eastAsia="Times New Roman" w:hAnsi="Times New Roman"/>
           <w:b/>
           <w:sz w:val="28"/>
         </w:rPr>
@@ -1096,17 +1154,18 @@
     </w:p>
     <w:p>
       <w:pPr>
-        <w:spacing/>
-        <w:ind w:left="620" w:hanging="360"/>
-        <w:rPr>
-          <w:rFonts w:ascii="Times New Roman" w:hAnsi="Times New Roman" w:cs="Times New Roman"/>
-          <w:sz w:val="28"/>
-          <w:szCs w:val="28"/>
-        </w:rPr>
-      </w:pPr>
-      <w:r>
-        <w:rPr>
-          <w:rFonts w:ascii="Times New Roman" w:hAnsi="Times New Roman" w:eastAsia="Times New Roman"/>
+        <w:spacing w:before="120" w:after="120" w:line="240" w:lineRule="auto"/>
+        <w:ind w:left="620" w:hanging="360"/>
+        <w:jc w:val="both"/>
+        <w:rPr>
+          <w:rFonts w:ascii="Times New Roman" w:hAnsi="Times New Roman" w:cs="Times New Roman"/>
+          <w:sz w:val="28"/>
+          <w:szCs w:val="28"/>
+        </w:rPr>
+      </w:pPr>
+      <w:r>
+        <w:rPr>
+          <w:rFonts w:ascii="Times New Roman" w:eastAsia="Times New Roman" w:hAnsi="Times New Roman"/>
           <w:sz w:val="28"/>
         </w:rPr>
         <w:t>1.  Hãy xây dựng lộ trình 10 năm để một người trẻ 30 tuổi đạt 1 triệu USD tài sản, giả định đang đầu tư vào SP/DV = [___], trình bày thành bảng chi tiết.</w:t>
@@ -1114,35 +1173,38 @@
     </w:p>
     <w:p>
       <w:pPr>
-        <w:spacing/>
-        <w:ind w:left="620" w:hanging="360"/>
-        <w:rPr>
-          <w:rFonts w:ascii="Times New Roman" w:hAnsi="Times New Roman" w:cs="Times New Roman"/>
-          <w:sz w:val="28"/>
-          <w:szCs w:val="28"/>
-        </w:rPr>
-      </w:pPr>
-      <w:r>
-        <w:rPr>
-          <w:rFonts w:ascii="Times New Roman" w:hAnsi="Times New Roman" w:eastAsia="Times New Roman"/>
-          <w:sz w:val="28"/>
-        </w:rPr>
+        <w:spacing w:before="120" w:after="120" w:line="240" w:lineRule="auto"/>
+        <w:ind w:left="620" w:hanging="360"/>
+        <w:jc w:val="both"/>
+        <w:rPr>
+          <w:rFonts w:ascii="Times New Roman" w:hAnsi="Times New Roman" w:cs="Times New Roman"/>
+          <w:sz w:val="28"/>
+          <w:szCs w:val="28"/>
+        </w:rPr>
+      </w:pPr>
+      <w:r>
+        <w:rPr>
+          <w:rFonts w:ascii="Times New Roman" w:eastAsia="Times New Roman" w:hAnsi="Times New Roman"/>
+          <w:sz w:val="28"/>
+        </w:rPr>
+        <w:lastRenderedPageBreak/>
         <w:t>2.  Phân tích 5 rủi ro tài chính lớn nhất khi đầu tư vào SP/DV = [___] năm 2025 và cách phòng tránh.</w:t>
       </w:r>
     </w:p>
     <w:p>
       <w:pPr>
-        <w:spacing/>
-        <w:ind w:left="620" w:hanging="360"/>
-        <w:rPr>
-          <w:rFonts w:ascii="Times New Roman" w:hAnsi="Times New Roman" w:cs="Times New Roman"/>
-          <w:sz w:val="28"/>
-          <w:szCs w:val="28"/>
-        </w:rPr>
-      </w:pPr>
-      <w:r>
-        <w:rPr>
-          <w:rFonts w:ascii="Times New Roman" w:hAnsi="Times New Roman" w:eastAsia="Times New Roman"/>
+        <w:spacing w:before="120" w:after="120" w:line="240" w:lineRule="auto"/>
+        <w:ind w:left="620" w:hanging="360"/>
+        <w:jc w:val="both"/>
+        <w:rPr>
+          <w:rFonts w:ascii="Times New Roman" w:hAnsi="Times New Roman" w:cs="Times New Roman"/>
+          <w:sz w:val="28"/>
+          <w:szCs w:val="28"/>
+        </w:rPr>
+      </w:pPr>
+      <w:r>
+        <w:rPr>
+          <w:rFonts w:ascii="Times New Roman" w:eastAsia="Times New Roman" w:hAnsi="Times New Roman"/>
           <w:sz w:val="28"/>
         </w:rPr>
         <w:t>3.  Soạn báo cáo so sánh lợi nhuận kỳ vọng khi đầu tư vào SP/DV = [___] so với gửi tiết kiệm và chứng khoán.</w:t>
@@ -1150,17 +1212,18 @@
     </w:p>
     <w:p>
       <w:pPr>
-        <w:spacing/>
-        <w:ind w:left="620" w:hanging="360"/>
-        <w:rPr>
-          <w:rFonts w:ascii="Times New Roman" w:hAnsi="Times New Roman" w:cs="Times New Roman"/>
-          <w:sz w:val="28"/>
-          <w:szCs w:val="28"/>
-        </w:rPr>
-      </w:pPr>
-      <w:r>
-        <w:rPr>
-          <w:rFonts w:ascii="Times New Roman" w:hAnsi="Times New Roman" w:eastAsia="Times New Roman"/>
+        <w:spacing w:before="120" w:after="120" w:line="240" w:lineRule="auto"/>
+        <w:ind w:left="620" w:hanging="360"/>
+        <w:jc w:val="both"/>
+        <w:rPr>
+          <w:rFonts w:ascii="Times New Roman" w:hAnsi="Times New Roman" w:cs="Times New Roman"/>
+          <w:sz w:val="28"/>
+          <w:szCs w:val="28"/>
+        </w:rPr>
+      </w:pPr>
+      <w:r>
+        <w:rPr>
+          <w:rFonts w:ascii="Times New Roman" w:eastAsia="Times New Roman" w:hAnsi="Times New Roman"/>
           <w:sz w:val="28"/>
         </w:rPr>
         <w:t>4.  Lập kế hoạch quản lý dòng tiền cho doanh nghiệp cung cấp SP/DV = [___] trong 12 tháng tới.</w:t>
@@ -1168,17 +1231,18 @@
     </w:p>
     <w:p>
       <w:pPr>
-        <w:spacing/>
-        <w:ind w:left="620" w:hanging="360"/>
-        <w:rPr>
-          <w:rFonts w:ascii="Times New Roman" w:hAnsi="Times New Roman" w:cs="Times New Roman"/>
-          <w:sz w:val="28"/>
-          <w:szCs w:val="28"/>
-        </w:rPr>
-      </w:pPr>
-      <w:r>
-        <w:rPr>
-          <w:rFonts w:ascii="Times New Roman" w:hAnsi="Times New Roman" w:eastAsia="Times New Roman"/>
+        <w:spacing w:before="120" w:after="120" w:line="240" w:lineRule="auto"/>
+        <w:ind w:left="620" w:hanging="360"/>
+        <w:jc w:val="both"/>
+        <w:rPr>
+          <w:rFonts w:ascii="Times New Roman" w:hAnsi="Times New Roman" w:cs="Times New Roman"/>
+          <w:sz w:val="28"/>
+          <w:szCs w:val="28"/>
+        </w:rPr>
+      </w:pPr>
+      <w:r>
+        <w:rPr>
+          <w:rFonts w:ascii="Times New Roman" w:eastAsia="Times New Roman" w:hAnsi="Times New Roman"/>
           <w:sz w:val="28"/>
         </w:rPr>
         <w:t>5.  Viết chiến lược gọi vốn 1 triệu USD từ quỹ đầu tư mạo hiểm cho startup cung cấp SP/DV = [___].</w:t>
@@ -1186,17 +1250,18 @@
     </w:p>
     <w:p>
       <w:pPr>
-        <w:spacing/>
-        <w:ind w:left="620" w:hanging="360"/>
-        <w:rPr>
-          <w:rFonts w:ascii="Times New Roman" w:hAnsi="Times New Roman" w:cs="Times New Roman"/>
-          <w:sz w:val="28"/>
-          <w:szCs w:val="28"/>
-        </w:rPr>
-      </w:pPr>
-      <w:r>
-        <w:rPr>
-          <w:rFonts w:ascii="Times New Roman" w:hAnsi="Times New Roman" w:eastAsia="Times New Roman"/>
+        <w:spacing w:before="120" w:after="120" w:line="240" w:lineRule="auto"/>
+        <w:ind w:left="620" w:hanging="360"/>
+        <w:jc w:val="both"/>
+        <w:rPr>
+          <w:rFonts w:ascii="Times New Roman" w:hAnsi="Times New Roman" w:cs="Times New Roman"/>
+          <w:sz w:val="28"/>
+          <w:szCs w:val="28"/>
+        </w:rPr>
+      </w:pPr>
+      <w:r>
+        <w:rPr>
+          <w:rFonts w:ascii="Times New Roman" w:eastAsia="Times New Roman" w:hAnsi="Times New Roman"/>
           <w:sz w:val="28"/>
         </w:rPr>
         <w:t>6.  Đưa ra 5 ý tưởng mô hình kinh doanh giúp tối đa hóa lợi nhuận cho SP/DV = [___].</w:t>
@@ -1204,17 +1269,18 @@
     </w:p>
     <w:p>
       <w:pPr>
-        <w:spacing/>
-        <w:ind w:left="620" w:hanging="360"/>
-        <w:rPr>
-          <w:rFonts w:ascii="Times New Roman" w:hAnsi="Times New Roman" w:cs="Times New Roman"/>
-          <w:sz w:val="28"/>
-          <w:szCs w:val="28"/>
-        </w:rPr>
-      </w:pPr>
-      <w:r>
-        <w:rPr>
-          <w:rFonts w:ascii="Times New Roman" w:hAnsi="Times New Roman" w:eastAsia="Times New Roman"/>
+        <w:spacing w:before="120" w:after="120" w:line="240" w:lineRule="auto"/>
+        <w:ind w:left="620" w:hanging="360"/>
+        <w:jc w:val="both"/>
+        <w:rPr>
+          <w:rFonts w:ascii="Times New Roman" w:hAnsi="Times New Roman" w:cs="Times New Roman"/>
+          <w:sz w:val="28"/>
+          <w:szCs w:val="28"/>
+        </w:rPr>
+      </w:pPr>
+      <w:r>
+        <w:rPr>
+          <w:rFonts w:ascii="Times New Roman" w:eastAsia="Times New Roman" w:hAnsi="Times New Roman"/>
           <w:sz w:val="28"/>
         </w:rPr>
         <w:t>7.  Viết báo cáo tài chính mẫu cho công ty đang bán SP/DV = [___], gồm doanh thu – chi phí – lợi nhuận.</w:t>
@@ -1222,17 +1288,18 @@
     </w:p>
     <w:p>
       <w:pPr>
-        <w:spacing/>
-        <w:ind w:left="620" w:hanging="360"/>
-        <w:rPr>
-          <w:rFonts w:ascii="Times New Roman" w:hAnsi="Times New Roman" w:cs="Times New Roman"/>
-          <w:sz w:val="28"/>
-          <w:szCs w:val="28"/>
-        </w:rPr>
-      </w:pPr>
-      <w:r>
-        <w:rPr>
-          <w:rFonts w:ascii="Times New Roman" w:hAnsi="Times New Roman" w:eastAsia="Times New Roman"/>
+        <w:spacing w:before="120" w:after="120" w:line="240" w:lineRule="auto"/>
+        <w:ind w:left="620" w:hanging="360"/>
+        <w:jc w:val="both"/>
+        <w:rPr>
+          <w:rFonts w:ascii="Times New Roman" w:hAnsi="Times New Roman" w:cs="Times New Roman"/>
+          <w:sz w:val="28"/>
+          <w:szCs w:val="28"/>
+        </w:rPr>
+      </w:pPr>
+      <w:r>
+        <w:rPr>
+          <w:rFonts w:ascii="Times New Roman" w:eastAsia="Times New Roman" w:hAnsi="Times New Roman"/>
           <w:sz w:val="28"/>
         </w:rPr>
         <w:t>8.  Hãy thiết kế danh mục đầu tư đa dạng, trong đó có SP/DV = [___], nhằm tối ưu lợi nhuận và giảm rủi ro.</w:t>
@@ -1240,17 +1307,18 @@
     </w:p>
     <w:p>
       <w:pPr>
-        <w:spacing/>
-        <w:ind w:left="620" w:hanging="360"/>
-        <w:rPr>
-          <w:rFonts w:ascii="Times New Roman" w:hAnsi="Times New Roman" w:cs="Times New Roman"/>
-          <w:sz w:val="28"/>
-          <w:szCs w:val="28"/>
-        </w:rPr>
-      </w:pPr>
-      <w:r>
-        <w:rPr>
-          <w:rFonts w:ascii="Times New Roman" w:hAnsi="Times New Roman" w:eastAsia="Times New Roman"/>
+        <w:spacing w:before="120" w:after="120" w:line="240" w:lineRule="auto"/>
+        <w:ind w:left="620" w:hanging="360"/>
+        <w:jc w:val="both"/>
+        <w:rPr>
+          <w:rFonts w:ascii="Times New Roman" w:hAnsi="Times New Roman" w:cs="Times New Roman"/>
+          <w:sz w:val="28"/>
+          <w:szCs w:val="28"/>
+        </w:rPr>
+      </w:pPr>
+      <w:r>
+        <w:rPr>
+          <w:rFonts w:ascii="Times New Roman" w:eastAsia="Times New Roman" w:hAnsi="Times New Roman"/>
           <w:sz w:val="28"/>
         </w:rPr>
         <w:t>9.  Soạn kịch bản exit strategy (thoái vốn) cho startup SP/DV = [___] sau 5 năm hoạt động.</w:t>
@@ -1258,17 +1326,18 @@
     </w:p>
     <w:p>
       <w:pPr>
-        <w:spacing/>
-        <w:ind w:left="620" w:hanging="360"/>
-        <w:rPr>
-          <w:rFonts w:ascii="Times New Roman" w:hAnsi="Times New Roman" w:cs="Times New Roman"/>
-          <w:sz w:val="28"/>
-          <w:szCs w:val="28"/>
-        </w:rPr>
-      </w:pPr>
-      <w:r>
-        <w:rPr>
-          <w:rFonts w:ascii="Times New Roman" w:hAnsi="Times New Roman" w:eastAsia="Times New Roman"/>
+        <w:spacing w:before="120" w:after="120" w:line="240" w:lineRule="auto"/>
+        <w:ind w:left="620" w:hanging="360"/>
+        <w:jc w:val="both"/>
+        <w:rPr>
+          <w:rFonts w:ascii="Times New Roman" w:hAnsi="Times New Roman" w:cs="Times New Roman"/>
+          <w:sz w:val="28"/>
+          <w:szCs w:val="28"/>
+        </w:rPr>
+      </w:pPr>
+      <w:r>
+        <w:rPr>
+          <w:rFonts w:ascii="Times New Roman" w:eastAsia="Times New Roman" w:hAnsi="Times New Roman"/>
           <w:sz w:val="28"/>
         </w:rPr>
         <w:t>10.Đưa ra chiến lược quản trị tài chính khủng hoảng khi doanh thu từ SP/DV = [___] giảm 50%.</w:t>
@@ -1276,9 +1345,8 @@
     </w:p>
     <w:p>
       <w:pPr>
-        <w:keepNext w:val="0"/>
-        <w:keepLines w:val="0"/>
-        <w:spacing/>
+        <w:spacing w:before="120" w:after="120" w:line="240" w:lineRule="auto"/>
+        <w:jc w:val="both"/>
         <w:rPr>
           <w:rFonts w:ascii="Times New Roman" w:hAnsi="Times New Roman" w:cs="Times New Roman"/>
           <w:b/>
@@ -1289,7 +1357,7 @@
       </w:pPr>
       <w:r>
         <w:rPr>
-          <w:rFonts w:ascii="Times New Roman" w:hAnsi="Times New Roman" w:eastAsia="Times New Roman"/>
+          <w:rFonts w:ascii="Times New Roman" w:eastAsia="Times New Roman" w:hAnsi="Times New Roman"/>
           <w:b/>
           <w:sz w:val="28"/>
         </w:rPr>
@@ -1298,17 +1366,18 @@
     </w:p>
     <w:p>
       <w:pPr>
-        <w:spacing/>
-        <w:ind w:left="620" w:hanging="360"/>
-        <w:rPr>
-          <w:rFonts w:ascii="Times New Roman" w:hAnsi="Times New Roman" w:cs="Times New Roman"/>
-          <w:sz w:val="28"/>
-          <w:szCs w:val="28"/>
-        </w:rPr>
-      </w:pPr>
-      <w:r>
-        <w:rPr>
-          <w:rFonts w:ascii="Times New Roman" w:hAnsi="Times New Roman" w:eastAsia="Times New Roman"/>
+        <w:spacing w:before="120" w:after="120" w:line="240" w:lineRule="auto"/>
+        <w:ind w:left="620" w:hanging="360"/>
+        <w:jc w:val="both"/>
+        <w:rPr>
+          <w:rFonts w:ascii="Times New Roman" w:hAnsi="Times New Roman" w:cs="Times New Roman"/>
+          <w:sz w:val="28"/>
+          <w:szCs w:val="28"/>
+        </w:rPr>
+      </w:pPr>
+      <w:r>
+        <w:rPr>
+          <w:rFonts w:ascii="Times New Roman" w:eastAsia="Times New Roman" w:hAnsi="Times New Roman"/>
           <w:sz w:val="28"/>
         </w:rPr>
         <w:t>1.  Hãy thiết kế sơ đồ tổ chức tối ưu cho công ty đang kinh doanh SP/DV = [___].</w:t>
@@ -1316,17 +1385,18 @@
     </w:p>
     <w:p>
       <w:pPr>
-        <w:spacing/>
-        <w:ind w:left="620" w:hanging="360"/>
-        <w:rPr>
-          <w:rFonts w:ascii="Times New Roman" w:hAnsi="Times New Roman" w:cs="Times New Roman"/>
-          <w:sz w:val="28"/>
-          <w:szCs w:val="28"/>
-        </w:rPr>
-      </w:pPr>
-      <w:r>
-        <w:rPr>
-          <w:rFonts w:ascii="Times New Roman" w:hAnsi="Times New Roman" w:eastAsia="Times New Roman"/>
+        <w:spacing w:before="120" w:after="120" w:line="240" w:lineRule="auto"/>
+        <w:ind w:left="620" w:hanging="360"/>
+        <w:jc w:val="both"/>
+        <w:rPr>
+          <w:rFonts w:ascii="Times New Roman" w:hAnsi="Times New Roman" w:cs="Times New Roman"/>
+          <w:sz w:val="28"/>
+          <w:szCs w:val="28"/>
+        </w:rPr>
+      </w:pPr>
+      <w:r>
+        <w:rPr>
+          <w:rFonts w:ascii="Times New Roman" w:eastAsia="Times New Roman" w:hAnsi="Times New Roman"/>
           <w:sz w:val="28"/>
         </w:rPr>
         <w:t>2.  Viết hướng dẫn quản lý đội ngũ sales bán SP/DV = [___], đảm bảo tăng trưởng doanh số bền vững.</w:t>
@@ -1334,17 +1404,18 @@
     </w:p>
     <w:p>
       <w:pPr>
-        <w:spacing/>
-        <w:ind w:left="620" w:hanging="360"/>
-        <w:rPr>
-          <w:rFonts w:ascii="Times New Roman" w:hAnsi="Times New Roman" w:cs="Times New Roman"/>
-          <w:sz w:val="28"/>
-          <w:szCs w:val="28"/>
-        </w:rPr>
-      </w:pPr>
-      <w:r>
-        <w:rPr>
-          <w:rFonts w:ascii="Times New Roman" w:hAnsi="Times New Roman" w:eastAsia="Times New Roman"/>
+        <w:spacing w:before="120" w:after="120" w:line="240" w:lineRule="auto"/>
+        <w:ind w:left="620" w:hanging="360"/>
+        <w:jc w:val="both"/>
+        <w:rPr>
+          <w:rFonts w:ascii="Times New Roman" w:hAnsi="Times New Roman" w:cs="Times New Roman"/>
+          <w:sz w:val="28"/>
+          <w:szCs w:val="28"/>
+        </w:rPr>
+      </w:pPr>
+      <w:r>
+        <w:rPr>
+          <w:rFonts w:ascii="Times New Roman" w:eastAsia="Times New Roman" w:hAnsi="Times New Roman"/>
           <w:sz w:val="28"/>
         </w:rPr>
         <w:t>3.  Soạn quy trình onboarding nhân viên mới cho công ty cung cấp SP/DV = [___].</w:t>
@@ -1352,17 +1423,18 @@
     </w:p>
     <w:p>
       <w:pPr>
-        <w:spacing/>
-        <w:ind w:left="620" w:hanging="360"/>
-        <w:rPr>
-          <w:rFonts w:ascii="Times New Roman" w:hAnsi="Times New Roman" w:cs="Times New Roman"/>
-          <w:sz w:val="28"/>
-          <w:szCs w:val="28"/>
-        </w:rPr>
-      </w:pPr>
-      <w:r>
-        <w:rPr>
-          <w:rFonts w:ascii="Times New Roman" w:hAnsi="Times New Roman" w:eastAsia="Times New Roman"/>
+        <w:spacing w:before="120" w:after="120" w:line="240" w:lineRule="auto"/>
+        <w:ind w:left="620" w:hanging="360"/>
+        <w:jc w:val="both"/>
+        <w:rPr>
+          <w:rFonts w:ascii="Times New Roman" w:hAnsi="Times New Roman" w:cs="Times New Roman"/>
+          <w:sz w:val="28"/>
+          <w:szCs w:val="28"/>
+        </w:rPr>
+      </w:pPr>
+      <w:r>
+        <w:rPr>
+          <w:rFonts w:ascii="Times New Roman" w:eastAsia="Times New Roman" w:hAnsi="Times New Roman"/>
           <w:sz w:val="28"/>
         </w:rPr>
         <w:t>4.  Đưa ra chiến lược giữ chân nhân sự giỏi trong công ty startup bán SP/DV = [___].</w:t>
@@ -1370,17 +1442,18 @@
     </w:p>
     <w:p>
       <w:pPr>
-        <w:spacing/>
-        <w:ind w:left="620" w:hanging="360"/>
-        <w:rPr>
-          <w:rFonts w:ascii="Times New Roman" w:hAnsi="Times New Roman" w:cs="Times New Roman"/>
-          <w:sz w:val="28"/>
-          <w:szCs w:val="28"/>
-        </w:rPr>
-      </w:pPr>
-      <w:r>
-        <w:rPr>
-          <w:rFonts w:ascii="Times New Roman" w:hAnsi="Times New Roman" w:eastAsia="Times New Roman"/>
+        <w:spacing w:before="120" w:after="120" w:line="240" w:lineRule="auto"/>
+        <w:ind w:left="620" w:hanging="360"/>
+        <w:jc w:val="both"/>
+        <w:rPr>
+          <w:rFonts w:ascii="Times New Roman" w:hAnsi="Times New Roman" w:cs="Times New Roman"/>
+          <w:sz w:val="28"/>
+          <w:szCs w:val="28"/>
+        </w:rPr>
+      </w:pPr>
+      <w:r>
+        <w:rPr>
+          <w:rFonts w:ascii="Times New Roman" w:eastAsia="Times New Roman" w:hAnsi="Times New Roman"/>
           <w:sz w:val="28"/>
         </w:rPr>
         <w:t>5.  Hãy viết bản OKR cho phòng Marketing chuyên phụ trách SP/DV = [___].</w:t>
@@ -1388,17 +1461,18 @@
     </w:p>
     <w:p>
       <w:pPr>
-        <w:spacing/>
-        <w:ind w:left="620" w:hanging="360"/>
-        <w:rPr>
-          <w:rFonts w:ascii="Times New Roman" w:hAnsi="Times New Roman" w:cs="Times New Roman"/>
-          <w:sz w:val="28"/>
-          <w:szCs w:val="28"/>
-        </w:rPr>
-      </w:pPr>
-      <w:r>
-        <w:rPr>
-          <w:rFonts w:ascii="Times New Roman" w:hAnsi="Times New Roman" w:eastAsia="Times New Roman"/>
+        <w:spacing w:before="120" w:after="120" w:line="240" w:lineRule="auto"/>
+        <w:ind w:left="620" w:hanging="360"/>
+        <w:jc w:val="both"/>
+        <w:rPr>
+          <w:rFonts w:ascii="Times New Roman" w:hAnsi="Times New Roman" w:cs="Times New Roman"/>
+          <w:sz w:val="28"/>
+          <w:szCs w:val="28"/>
+        </w:rPr>
+      </w:pPr>
+      <w:r>
+        <w:rPr>
+          <w:rFonts w:ascii="Times New Roman" w:eastAsia="Times New Roman" w:hAnsi="Times New Roman"/>
           <w:sz w:val="28"/>
         </w:rPr>
         <w:t>6.  Tạo SOP chuẩn ISO cho quy trình bán hàng SP/DV = [___].</w:t>
@@ -1406,17 +1480,18 @@
     </w:p>
     <w:p>
       <w:pPr>
-        <w:spacing/>
-        <w:ind w:left="620" w:hanging="360"/>
-        <w:rPr>
-          <w:rFonts w:ascii="Times New Roman" w:hAnsi="Times New Roman" w:cs="Times New Roman"/>
-          <w:sz w:val="28"/>
-          <w:szCs w:val="28"/>
-        </w:rPr>
-      </w:pPr>
-      <w:r>
-        <w:rPr>
-          <w:rFonts w:ascii="Times New Roman" w:hAnsi="Times New Roman" w:eastAsia="Times New Roman"/>
+        <w:spacing w:before="120" w:after="120" w:line="240" w:lineRule="auto"/>
+        <w:ind w:left="620" w:hanging="360"/>
+        <w:jc w:val="both"/>
+        <w:rPr>
+          <w:rFonts w:ascii="Times New Roman" w:hAnsi="Times New Roman" w:cs="Times New Roman"/>
+          <w:sz w:val="28"/>
+          <w:szCs w:val="28"/>
+        </w:rPr>
+      </w:pPr>
+      <w:r>
+        <w:rPr>
+          <w:rFonts w:ascii="Times New Roman" w:eastAsia="Times New Roman" w:hAnsi="Times New Roman"/>
           <w:sz w:val="28"/>
         </w:rPr>
         <w:t>7.  Soạn kế hoạch đào tạo kỹ năng mềm cho nhân viên bán SP/DV = [___].</w:t>
@@ -1424,17 +1499,18 @@
     </w:p>
     <w:p>
       <w:pPr>
-        <w:spacing/>
-        <w:ind w:left="620" w:hanging="360"/>
-        <w:rPr>
-          <w:rFonts w:ascii="Times New Roman" w:hAnsi="Times New Roman" w:cs="Times New Roman"/>
-          <w:sz w:val="28"/>
-          <w:szCs w:val="28"/>
-        </w:rPr>
-      </w:pPr>
-      <w:r>
-        <w:rPr>
-          <w:rFonts w:ascii="Times New Roman" w:hAnsi="Times New Roman" w:eastAsia="Times New Roman"/>
+        <w:spacing w:before="120" w:after="120" w:line="240" w:lineRule="auto"/>
+        <w:ind w:left="620" w:hanging="360"/>
+        <w:jc w:val="both"/>
+        <w:rPr>
+          <w:rFonts w:ascii="Times New Roman" w:hAnsi="Times New Roman" w:cs="Times New Roman"/>
+          <w:sz w:val="28"/>
+          <w:szCs w:val="28"/>
+        </w:rPr>
+      </w:pPr>
+      <w:r>
+        <w:rPr>
+          <w:rFonts w:ascii="Times New Roman" w:eastAsia="Times New Roman" w:hAnsi="Times New Roman"/>
           <w:sz w:val="28"/>
         </w:rPr>
         <w:t>8.  Đưa ra chiến lược quản trị khủng hoảng khi khách hàng phàn nàn công khai về SP/DV = [___] trên mạng xã hội.</w:t>
@@ -1442,17 +1518,18 @@
     </w:p>
     <w:p>
       <w:pPr>
-        <w:spacing/>
-        <w:ind w:left="620" w:hanging="360"/>
-        <w:rPr>
-          <w:rFonts w:ascii="Times New Roman" w:hAnsi="Times New Roman" w:cs="Times New Roman"/>
-          <w:sz w:val="28"/>
-          <w:szCs w:val="28"/>
-        </w:rPr>
-      </w:pPr>
-      <w:r>
-        <w:rPr>
-          <w:rFonts w:ascii="Times New Roman" w:hAnsi="Times New Roman" w:eastAsia="Times New Roman"/>
+        <w:spacing w:before="120" w:after="120" w:line="240" w:lineRule="auto"/>
+        <w:ind w:left="620" w:hanging="360"/>
+        <w:jc w:val="both"/>
+        <w:rPr>
+          <w:rFonts w:ascii="Times New Roman" w:hAnsi="Times New Roman" w:cs="Times New Roman"/>
+          <w:sz w:val="28"/>
+          <w:szCs w:val="28"/>
+        </w:rPr>
+      </w:pPr>
+      <w:r>
+        <w:rPr>
+          <w:rFonts w:ascii="Times New Roman" w:eastAsia="Times New Roman" w:hAnsi="Times New Roman"/>
           <w:sz w:val="28"/>
         </w:rPr>
         <w:t>9.  Viết kế hoạch huấn luyện đội ngũ quản lý cấp trung trong công ty SP/DV = [___].</w:t>
@@ -1460,17 +1537,18 @@
     </w:p>
     <w:p>
       <w:pPr>
-        <w:spacing/>
-        <w:ind w:left="620" w:hanging="360"/>
-        <w:rPr>
-          <w:rFonts w:ascii="Times New Roman" w:hAnsi="Times New Roman" w:cs="Times New Roman"/>
-          <w:sz w:val="28"/>
-          <w:szCs w:val="28"/>
-        </w:rPr>
-      </w:pPr>
-      <w:r>
-        <w:rPr>
-          <w:rFonts w:ascii="Times New Roman" w:hAnsi="Times New Roman" w:eastAsia="Times New Roman"/>
+        <w:spacing w:before="120" w:after="120" w:line="240" w:lineRule="auto"/>
+        <w:ind w:left="620" w:hanging="360"/>
+        <w:jc w:val="both"/>
+        <w:rPr>
+          <w:rFonts w:ascii="Times New Roman" w:hAnsi="Times New Roman" w:cs="Times New Roman"/>
+          <w:sz w:val="28"/>
+          <w:szCs w:val="28"/>
+        </w:rPr>
+      </w:pPr>
+      <w:r>
+        <w:rPr>
+          <w:rFonts w:ascii="Times New Roman" w:eastAsia="Times New Roman" w:hAnsi="Times New Roman"/>
           <w:sz w:val="28"/>
         </w:rPr>
         <w:t>10.Soạn bản hướng dẫn quản lý rủi ro vận hành trong doanh nghiệp cung cấp SP/DV = [___].</w:t>
@@ -1478,9 +1556,8 @@
     </w:p>
     <w:p>
       <w:pPr>
-        <w:keepNext w:val="0"/>
-        <w:keepLines w:val="0"/>
-        <w:spacing/>
+        <w:spacing w:before="120" w:after="120" w:line="240" w:lineRule="auto"/>
+        <w:jc w:val="both"/>
         <w:rPr>
           <w:rFonts w:ascii="Times New Roman" w:hAnsi="Times New Roman" w:cs="Times New Roman"/>
           <w:b/>
@@ -1491,7 +1568,7 @@
       </w:pPr>
       <w:r>
         <w:rPr>
-          <w:rFonts w:ascii="Times New Roman" w:hAnsi="Times New Roman" w:eastAsia="Times New Roman"/>
+          <w:rFonts w:ascii="Times New Roman" w:eastAsia="Times New Roman" w:hAnsi="Times New Roman"/>
           <w:b/>
           <w:sz w:val="28"/>
         </w:rPr>
@@ -1500,35 +1577,38 @@
     </w:p>
     <w:p>
       <w:pPr>
-        <w:spacing/>
-        <w:ind w:left="620" w:hanging="360"/>
-        <w:rPr>
-          <w:rFonts w:ascii="Times New Roman" w:hAnsi="Times New Roman" w:cs="Times New Roman"/>
-          <w:sz w:val="28"/>
-          <w:szCs w:val="28"/>
-        </w:rPr>
-      </w:pPr>
-      <w:r>
-        <w:rPr>
-          <w:rFonts w:ascii="Times New Roman" w:hAnsi="Times New Roman" w:eastAsia="Times New Roman"/>
-          <w:sz w:val="28"/>
-        </w:rPr>
+        <w:spacing w:before="120" w:after="120" w:line="240" w:lineRule="auto"/>
+        <w:ind w:left="620" w:hanging="360"/>
+        <w:jc w:val="both"/>
+        <w:rPr>
+          <w:rFonts w:ascii="Times New Roman" w:hAnsi="Times New Roman" w:cs="Times New Roman"/>
+          <w:sz w:val="28"/>
+          <w:szCs w:val="28"/>
+        </w:rPr>
+      </w:pPr>
+      <w:r>
+        <w:rPr>
+          <w:rFonts w:ascii="Times New Roman" w:eastAsia="Times New Roman" w:hAnsi="Times New Roman"/>
+          <w:sz w:val="28"/>
+        </w:rPr>
+        <w:lastRenderedPageBreak/>
         <w:t>1.  Hãy lập kế hoạch mở rộng thị trường quốc tế cho SP/DV = [___], tập trung vào Đông Nam Á.</w:t>
       </w:r>
     </w:p>
     <w:p>
       <w:pPr>
-        <w:spacing/>
-        <w:ind w:left="620" w:hanging="360"/>
-        <w:rPr>
-          <w:rFonts w:ascii="Times New Roman" w:hAnsi="Times New Roman" w:cs="Times New Roman"/>
-          <w:sz w:val="28"/>
-          <w:szCs w:val="28"/>
-        </w:rPr>
-      </w:pPr>
-      <w:r>
-        <w:rPr>
-          <w:rFonts w:ascii="Times New Roman" w:hAnsi="Times New Roman" w:eastAsia="Times New Roman"/>
+        <w:spacing w:before="120" w:after="120" w:line="240" w:lineRule="auto"/>
+        <w:ind w:left="620" w:hanging="360"/>
+        <w:jc w:val="both"/>
+        <w:rPr>
+          <w:rFonts w:ascii="Times New Roman" w:hAnsi="Times New Roman" w:cs="Times New Roman"/>
+          <w:sz w:val="28"/>
+          <w:szCs w:val="28"/>
+        </w:rPr>
+      </w:pPr>
+      <w:r>
+        <w:rPr>
+          <w:rFonts w:ascii="Times New Roman" w:eastAsia="Times New Roman" w:hAnsi="Times New Roman"/>
           <w:sz w:val="28"/>
         </w:rPr>
         <w:t>2.  Viết chiến lược mở rộng kênh phân phối để tăng gấp 3 doanh thu từ SP/DV = [___] trong 2 năm.</w:t>
@@ -1536,17 +1616,18 @@
     </w:p>
     <w:p>
       <w:pPr>
-        <w:spacing/>
-        <w:ind w:left="620" w:hanging="360"/>
-        <w:rPr>
-          <w:rFonts w:ascii="Times New Roman" w:hAnsi="Times New Roman" w:cs="Times New Roman"/>
-          <w:sz w:val="28"/>
-          <w:szCs w:val="28"/>
-        </w:rPr>
-      </w:pPr>
-      <w:r>
-        <w:rPr>
-          <w:rFonts w:ascii="Times New Roman" w:hAnsi="Times New Roman" w:eastAsia="Times New Roman"/>
+        <w:spacing w:before="120" w:after="120" w:line="240" w:lineRule="auto"/>
+        <w:ind w:left="620" w:hanging="360"/>
+        <w:jc w:val="both"/>
+        <w:rPr>
+          <w:rFonts w:ascii="Times New Roman" w:hAnsi="Times New Roman" w:cs="Times New Roman"/>
+          <w:sz w:val="28"/>
+          <w:szCs w:val="28"/>
+        </w:rPr>
+      </w:pPr>
+      <w:r>
+        <w:rPr>
+          <w:rFonts w:ascii="Times New Roman" w:eastAsia="Times New Roman" w:hAnsi="Times New Roman"/>
           <w:sz w:val="28"/>
         </w:rPr>
         <w:t>3.  Hãy đề xuất 5 ý tưởng growth hacking giúp tăng nhanh người dùng mới cho SP/DV = [___].</w:t>
@@ -1554,17 +1635,18 @@
     </w:p>
     <w:p>
       <w:pPr>
-        <w:spacing/>
-        <w:ind w:left="620" w:hanging="360"/>
-        <w:rPr>
-          <w:rFonts w:ascii="Times New Roman" w:hAnsi="Times New Roman" w:cs="Times New Roman"/>
-          <w:sz w:val="28"/>
-          <w:szCs w:val="28"/>
-        </w:rPr>
-      </w:pPr>
-      <w:r>
-        <w:rPr>
-          <w:rFonts w:ascii="Times New Roman" w:hAnsi="Times New Roman" w:eastAsia="Times New Roman"/>
+        <w:spacing w:before="120" w:after="120" w:line="240" w:lineRule="auto"/>
+        <w:ind w:left="620" w:hanging="360"/>
+        <w:jc w:val="both"/>
+        <w:rPr>
+          <w:rFonts w:ascii="Times New Roman" w:hAnsi="Times New Roman" w:cs="Times New Roman"/>
+          <w:sz w:val="28"/>
+          <w:szCs w:val="28"/>
+        </w:rPr>
+      </w:pPr>
+      <w:r>
+        <w:rPr>
+          <w:rFonts w:ascii="Times New Roman" w:eastAsia="Times New Roman" w:hAnsi="Times New Roman"/>
           <w:sz w:val="28"/>
         </w:rPr>
         <w:t>4.  Viết kế hoạch franchise (nhượng quyền) cho SP/DV = [___].</w:t>
@@ -1572,17 +1654,18 @@
     </w:p>
     <w:p>
       <w:pPr>
-        <w:spacing/>
-        <w:ind w:left="620" w:hanging="360"/>
-        <w:rPr>
-          <w:rFonts w:ascii="Times New Roman" w:hAnsi="Times New Roman" w:cs="Times New Roman"/>
-          <w:sz w:val="28"/>
-          <w:szCs w:val="28"/>
-        </w:rPr>
-      </w:pPr>
-      <w:r>
-        <w:rPr>
-          <w:rFonts w:ascii="Times New Roman" w:hAnsi="Times New Roman" w:eastAsia="Times New Roman"/>
+        <w:spacing w:before="120" w:after="120" w:line="240" w:lineRule="auto"/>
+        <w:ind w:left="620" w:hanging="360"/>
+        <w:jc w:val="both"/>
+        <w:rPr>
+          <w:rFonts w:ascii="Times New Roman" w:hAnsi="Times New Roman" w:cs="Times New Roman"/>
+          <w:sz w:val="28"/>
+          <w:szCs w:val="28"/>
+        </w:rPr>
+      </w:pPr>
+      <w:r>
+        <w:rPr>
+          <w:rFonts w:ascii="Times New Roman" w:eastAsia="Times New Roman" w:hAnsi="Times New Roman"/>
           <w:sz w:val="28"/>
         </w:rPr>
         <w:t>5.  Lập chiến lược M&amp;A để công ty kinh doanh SP/DV = [___] thâu tóm đối thủ nhỏ hơn.</w:t>
@@ -1590,17 +1673,18 @@
     </w:p>
     <w:p>
       <w:pPr>
-        <w:spacing/>
-        <w:ind w:left="620" w:hanging="360"/>
-        <w:rPr>
-          <w:rFonts w:ascii="Times New Roman" w:hAnsi="Times New Roman" w:cs="Times New Roman"/>
-          <w:sz w:val="28"/>
-          <w:szCs w:val="28"/>
-        </w:rPr>
-      </w:pPr>
-      <w:r>
-        <w:rPr>
-          <w:rFonts w:ascii="Times New Roman" w:hAnsi="Times New Roman" w:eastAsia="Times New Roman"/>
+        <w:spacing w:before="120" w:after="120" w:line="240" w:lineRule="auto"/>
+        <w:ind w:left="620" w:hanging="360"/>
+        <w:jc w:val="both"/>
+        <w:rPr>
+          <w:rFonts w:ascii="Times New Roman" w:hAnsi="Times New Roman" w:cs="Times New Roman"/>
+          <w:sz w:val="28"/>
+          <w:szCs w:val="28"/>
+        </w:rPr>
+      </w:pPr>
+      <w:r>
+        <w:rPr>
+          <w:rFonts w:ascii="Times New Roman" w:eastAsia="Times New Roman" w:hAnsi="Times New Roman"/>
           <w:sz w:val="28"/>
         </w:rPr>
         <w:t>6.  Soạn chiến lược xây dựng cộng đồng khách hàng trung thành cho SP/DV = [___].</w:t>
@@ -1608,17 +1692,18 @@
     </w:p>
     <w:p>
       <w:pPr>
-        <w:spacing/>
-        <w:ind w:left="620" w:hanging="360"/>
-        <w:rPr>
-          <w:rFonts w:ascii="Times New Roman" w:hAnsi="Times New Roman" w:cs="Times New Roman"/>
-          <w:sz w:val="28"/>
-          <w:szCs w:val="28"/>
-        </w:rPr>
-      </w:pPr>
-      <w:r>
-        <w:rPr>
-          <w:rFonts w:ascii="Times New Roman" w:hAnsi="Times New Roman" w:eastAsia="Times New Roman"/>
+        <w:spacing w:before="120" w:after="120" w:line="240" w:lineRule="auto"/>
+        <w:ind w:left="620" w:hanging="360"/>
+        <w:jc w:val="both"/>
+        <w:rPr>
+          <w:rFonts w:ascii="Times New Roman" w:hAnsi="Times New Roman" w:cs="Times New Roman"/>
+          <w:sz w:val="28"/>
+          <w:szCs w:val="28"/>
+        </w:rPr>
+      </w:pPr>
+      <w:r>
+        <w:rPr>
+          <w:rFonts w:ascii="Times New Roman" w:eastAsia="Times New Roman" w:hAnsi="Times New Roman"/>
           <w:sz w:val="28"/>
         </w:rPr>
         <w:t>7.  Đưa ra ý tưởng mở rộng hệ sinh thái sản phẩm xung quanh SP/DV = [___].</w:t>
@@ -1626,17 +1711,18 @@
     </w:p>
     <w:p>
       <w:pPr>
-        <w:spacing/>
-        <w:ind w:left="620" w:hanging="360"/>
-        <w:rPr>
-          <w:rFonts w:ascii="Times New Roman" w:hAnsi="Times New Roman" w:cs="Times New Roman"/>
-          <w:sz w:val="28"/>
-          <w:szCs w:val="28"/>
-        </w:rPr>
-      </w:pPr>
-      <w:r>
-        <w:rPr>
-          <w:rFonts w:ascii="Times New Roman" w:hAnsi="Times New Roman" w:eastAsia="Times New Roman"/>
+        <w:spacing w:before="120" w:after="120" w:line="240" w:lineRule="auto"/>
+        <w:ind w:left="620" w:hanging="360"/>
+        <w:jc w:val="both"/>
+        <w:rPr>
+          <w:rFonts w:ascii="Times New Roman" w:hAnsi="Times New Roman" w:cs="Times New Roman"/>
+          <w:sz w:val="28"/>
+          <w:szCs w:val="28"/>
+        </w:rPr>
+      </w:pPr>
+      <w:r>
+        <w:rPr>
+          <w:rFonts w:ascii="Times New Roman" w:eastAsia="Times New Roman" w:hAnsi="Times New Roman"/>
           <w:sz w:val="28"/>
         </w:rPr>
         <w:t>8.  Viết kế hoạch mở rộng từ thị trường online sang offline cho SP/DV = [___].</w:t>
@@ -1644,17 +1730,18 @@
     </w:p>
     <w:p>
       <w:pPr>
-        <w:spacing/>
-        <w:ind w:left="620" w:hanging="360"/>
-        <w:rPr>
-          <w:rFonts w:ascii="Times New Roman" w:hAnsi="Times New Roman" w:cs="Times New Roman"/>
-          <w:sz w:val="28"/>
-          <w:szCs w:val="28"/>
-        </w:rPr>
-      </w:pPr>
-      <w:r>
-        <w:rPr>
-          <w:rFonts w:ascii="Times New Roman" w:hAnsi="Times New Roman" w:eastAsia="Times New Roman"/>
+        <w:spacing w:before="120" w:after="120" w:line="240" w:lineRule="auto"/>
+        <w:ind w:left="620" w:hanging="360"/>
+        <w:jc w:val="both"/>
+        <w:rPr>
+          <w:rFonts w:ascii="Times New Roman" w:hAnsi="Times New Roman" w:cs="Times New Roman"/>
+          <w:sz w:val="28"/>
+          <w:szCs w:val="28"/>
+        </w:rPr>
+      </w:pPr>
+      <w:r>
+        <w:rPr>
+          <w:rFonts w:ascii="Times New Roman" w:eastAsia="Times New Roman" w:hAnsi="Times New Roman"/>
           <w:sz w:val="28"/>
         </w:rPr>
         <w:t>9.  Đưa ra 3 kịch bản tăng trưởng doanh thu bền vững cho SP/DV = [___].</w:t>
@@ -1662,17 +1749,18 @@
     </w:p>
     <w:p>
       <w:pPr>
-        <w:spacing/>
-        <w:ind w:left="620" w:hanging="360"/>
-        <w:rPr>
-          <w:rFonts w:ascii="Times New Roman" w:hAnsi="Times New Roman" w:cs="Times New Roman"/>
-          <w:sz w:val="28"/>
-          <w:szCs w:val="28"/>
-        </w:rPr>
-      </w:pPr>
-      <w:r>
-        <w:rPr>
-          <w:rFonts w:ascii="Times New Roman" w:hAnsi="Times New Roman" w:eastAsia="Times New Roman"/>
+        <w:spacing w:before="120" w:after="120" w:line="240" w:lineRule="auto"/>
+        <w:ind w:left="620" w:hanging="360"/>
+        <w:jc w:val="both"/>
+        <w:rPr>
+          <w:rFonts w:ascii="Times New Roman" w:hAnsi="Times New Roman" w:cs="Times New Roman"/>
+          <w:sz w:val="28"/>
+          <w:szCs w:val="28"/>
+        </w:rPr>
+      </w:pPr>
+      <w:r>
+        <w:rPr>
+          <w:rFonts w:ascii="Times New Roman" w:eastAsia="Times New Roman" w:hAnsi="Times New Roman"/>
           <w:sz w:val="28"/>
         </w:rPr>
         <w:t>10.Hãy viết lộ trình chuyển đổi công ty từ startup nhỏ sang doanh nghiệp tầm trung với SP/DV = [___].</w:t>
@@ -1680,9 +1768,8 @@
     </w:p>
     <w:p>
       <w:pPr>
-        <w:keepNext w:val="0"/>
-        <w:keepLines w:val="0"/>
-        <w:spacing/>
+        <w:spacing w:before="120" w:after="120" w:line="240" w:lineRule="auto"/>
+        <w:jc w:val="both"/>
         <w:rPr>
           <w:rFonts w:ascii="Times New Roman" w:hAnsi="Times New Roman" w:cs="Times New Roman"/>
           <w:b/>
@@ -1693,7 +1780,7 @@
       </w:pPr>
       <w:r>
         <w:rPr>
-          <w:rFonts w:ascii="Times New Roman" w:hAnsi="Times New Roman" w:eastAsia="Times New Roman"/>
+          <w:rFonts w:ascii="Times New Roman" w:eastAsia="Times New Roman" w:hAnsi="Times New Roman"/>
           <w:b/>
           <w:sz w:val="28"/>
         </w:rPr>
@@ -1702,17 +1789,18 @@
     </w:p>
     <w:p>
       <w:pPr>
-        <w:spacing/>
-        <w:ind w:left="620" w:hanging="360"/>
-        <w:rPr>
-          <w:rFonts w:ascii="Times New Roman" w:hAnsi="Times New Roman" w:cs="Times New Roman"/>
-          <w:sz w:val="28"/>
-          <w:szCs w:val="28"/>
-        </w:rPr>
-      </w:pPr>
-      <w:r>
-        <w:rPr>
-          <w:rFonts w:ascii="Times New Roman" w:hAnsi="Times New Roman" w:eastAsia="Times New Roman"/>
+        <w:spacing w:before="120" w:after="120" w:line="240" w:lineRule="auto"/>
+        <w:ind w:left="620" w:hanging="360"/>
+        <w:jc w:val="both"/>
+        <w:rPr>
+          <w:rFonts w:ascii="Times New Roman" w:hAnsi="Times New Roman" w:cs="Times New Roman"/>
+          <w:sz w:val="28"/>
+          <w:szCs w:val="28"/>
+        </w:rPr>
+      </w:pPr>
+      <w:r>
+        <w:rPr>
+          <w:rFonts w:ascii="Times New Roman" w:eastAsia="Times New Roman" w:hAnsi="Times New Roman"/>
           <w:sz w:val="28"/>
         </w:rPr>
         <w:t>1.  Hãy phân tích 3 ý tưởng startup trong lĩnh vực SP/DV = [___] theo mô hình Lean Startup.</w:t>
@@ -1720,17 +1808,18 @@
     </w:p>
     <w:p>
       <w:pPr>
-        <w:spacing/>
-        <w:ind w:left="620" w:hanging="360"/>
-        <w:rPr>
-          <w:rFonts w:ascii="Times New Roman" w:hAnsi="Times New Roman" w:cs="Times New Roman"/>
-          <w:sz w:val="28"/>
-          <w:szCs w:val="28"/>
-        </w:rPr>
-      </w:pPr>
-      <w:r>
-        <w:rPr>
-          <w:rFonts w:ascii="Times New Roman" w:hAnsi="Times New Roman" w:eastAsia="Times New Roman"/>
+        <w:spacing w:before="120" w:after="120" w:line="240" w:lineRule="auto"/>
+        <w:ind w:left="620" w:hanging="360"/>
+        <w:jc w:val="both"/>
+        <w:rPr>
+          <w:rFonts w:ascii="Times New Roman" w:hAnsi="Times New Roman" w:cs="Times New Roman"/>
+          <w:sz w:val="28"/>
+          <w:szCs w:val="28"/>
+        </w:rPr>
+      </w:pPr>
+      <w:r>
+        <w:rPr>
+          <w:rFonts w:ascii="Times New Roman" w:eastAsia="Times New Roman" w:hAnsi="Times New Roman"/>
           <w:sz w:val="28"/>
         </w:rPr>
         <w:t>2.  Viết bản Business Model Canvas hoàn chỉnh cho SP/DV = [___].</w:t>
@@ -1738,17 +1827,18 @@
     </w:p>
     <w:p>
       <w:pPr>
-        <w:spacing/>
-        <w:ind w:left="620" w:hanging="360"/>
-        <w:rPr>
-          <w:rFonts w:ascii="Times New Roman" w:hAnsi="Times New Roman" w:cs="Times New Roman"/>
-          <w:sz w:val="28"/>
-          <w:szCs w:val="28"/>
-        </w:rPr>
-      </w:pPr>
-      <w:r>
-        <w:rPr>
-          <w:rFonts w:ascii="Times New Roman" w:hAnsi="Times New Roman" w:eastAsia="Times New Roman"/>
+        <w:spacing w:before="120" w:after="120" w:line="240" w:lineRule="auto"/>
+        <w:ind w:left="620" w:hanging="360"/>
+        <w:jc w:val="both"/>
+        <w:rPr>
+          <w:rFonts w:ascii="Times New Roman" w:hAnsi="Times New Roman" w:cs="Times New Roman"/>
+          <w:sz w:val="28"/>
+          <w:szCs w:val="28"/>
+        </w:rPr>
+      </w:pPr>
+      <w:r>
+        <w:rPr>
+          <w:rFonts w:ascii="Times New Roman" w:eastAsia="Times New Roman" w:hAnsi="Times New Roman"/>
           <w:sz w:val="28"/>
         </w:rPr>
         <w:t>3.  Đưa ra 5 ý tưởng đổi mới sáng tạo cho SP/DV = [___] nhằm thu hút thế hệ Gen Z.</w:t>
@@ -1756,17 +1846,18 @@
     </w:p>
     <w:p>
       <w:pPr>
-        <w:spacing/>
-        <w:ind w:left="620" w:hanging="360"/>
-        <w:rPr>
-          <w:rFonts w:ascii="Times New Roman" w:hAnsi="Times New Roman" w:cs="Times New Roman"/>
-          <w:sz w:val="28"/>
-          <w:szCs w:val="28"/>
-        </w:rPr>
-      </w:pPr>
-      <w:r>
-        <w:rPr>
-          <w:rFonts w:ascii="Times New Roman" w:hAnsi="Times New Roman" w:eastAsia="Times New Roman"/>
+        <w:spacing w:before="120" w:after="120" w:line="240" w:lineRule="auto"/>
+        <w:ind w:left="620" w:hanging="360"/>
+        <w:jc w:val="both"/>
+        <w:rPr>
+          <w:rFonts w:ascii="Times New Roman" w:hAnsi="Times New Roman" w:cs="Times New Roman"/>
+          <w:sz w:val="28"/>
+          <w:szCs w:val="28"/>
+        </w:rPr>
+      </w:pPr>
+      <w:r>
+        <w:rPr>
+          <w:rFonts w:ascii="Times New Roman" w:eastAsia="Times New Roman" w:hAnsi="Times New Roman"/>
           <w:sz w:val="28"/>
         </w:rPr>
         <w:t>4.  Soạn pitch deck 10 slides để gọi vốn cho startup cung cấp SP/DV = [___].</w:t>
@@ -1774,17 +1865,18 @@
     </w:p>
     <w:p>
       <w:pPr>
-        <w:spacing/>
-        <w:ind w:left="620" w:hanging="360"/>
-        <w:rPr>
-          <w:rFonts w:ascii="Times New Roman" w:hAnsi="Times New Roman" w:cs="Times New Roman"/>
-          <w:sz w:val="28"/>
-          <w:szCs w:val="28"/>
-        </w:rPr>
-      </w:pPr>
-      <w:r>
-        <w:rPr>
-          <w:rFonts w:ascii="Times New Roman" w:hAnsi="Times New Roman" w:eastAsia="Times New Roman"/>
+        <w:spacing w:before="120" w:after="120" w:line="240" w:lineRule="auto"/>
+        <w:ind w:left="620" w:hanging="360"/>
+        <w:jc w:val="both"/>
+        <w:rPr>
+          <w:rFonts w:ascii="Times New Roman" w:hAnsi="Times New Roman" w:cs="Times New Roman"/>
+          <w:sz w:val="28"/>
+          <w:szCs w:val="28"/>
+        </w:rPr>
+      </w:pPr>
+      <w:r>
+        <w:rPr>
+          <w:rFonts w:ascii="Times New Roman" w:eastAsia="Times New Roman" w:hAnsi="Times New Roman"/>
           <w:sz w:val="28"/>
         </w:rPr>
         <w:t>5.  Hãy viết bản kế hoạch MVP cho SP/DV = [___] trong 60 ngày.</w:t>
@@ -1792,17 +1884,18 @@
     </w:p>
     <w:p>
       <w:pPr>
-        <w:spacing/>
-        <w:ind w:left="620" w:hanging="360"/>
-        <w:rPr>
-          <w:rFonts w:ascii="Times New Roman" w:hAnsi="Times New Roman" w:cs="Times New Roman"/>
-          <w:sz w:val="28"/>
-          <w:szCs w:val="28"/>
-        </w:rPr>
-      </w:pPr>
-      <w:r>
-        <w:rPr>
-          <w:rFonts w:ascii="Times New Roman" w:hAnsi="Times New Roman" w:eastAsia="Times New Roman"/>
+        <w:spacing w:before="120" w:after="120" w:line="240" w:lineRule="auto"/>
+        <w:ind w:left="620" w:hanging="360"/>
+        <w:jc w:val="both"/>
+        <w:rPr>
+          <w:rFonts w:ascii="Times New Roman" w:hAnsi="Times New Roman" w:cs="Times New Roman"/>
+          <w:sz w:val="28"/>
+          <w:szCs w:val="28"/>
+        </w:rPr>
+      </w:pPr>
+      <w:r>
+        <w:rPr>
+          <w:rFonts w:ascii="Times New Roman" w:eastAsia="Times New Roman" w:hAnsi="Times New Roman"/>
           <w:sz w:val="28"/>
         </w:rPr>
         <w:t>6.  Phân tích rào cản gia nhập ngành khi khởi nghiệp với SP/DV = [___].</w:t>
@@ -1810,17 +1903,18 @@
     </w:p>
     <w:p>
       <w:pPr>
-        <w:spacing/>
-        <w:ind w:left="620" w:hanging="360"/>
-        <w:rPr>
-          <w:rFonts w:ascii="Times New Roman" w:hAnsi="Times New Roman" w:cs="Times New Roman"/>
-          <w:sz w:val="28"/>
-          <w:szCs w:val="28"/>
-        </w:rPr>
-      </w:pPr>
-      <w:r>
-        <w:rPr>
-          <w:rFonts w:ascii="Times New Roman" w:hAnsi="Times New Roman" w:eastAsia="Times New Roman"/>
+        <w:spacing w:before="120" w:after="120" w:line="240" w:lineRule="auto"/>
+        <w:ind w:left="620" w:hanging="360"/>
+        <w:jc w:val="both"/>
+        <w:rPr>
+          <w:rFonts w:ascii="Times New Roman" w:hAnsi="Times New Roman" w:cs="Times New Roman"/>
+          <w:sz w:val="28"/>
+          <w:szCs w:val="28"/>
+        </w:rPr>
+      </w:pPr>
+      <w:r>
+        <w:rPr>
+          <w:rFonts w:ascii="Times New Roman" w:eastAsia="Times New Roman" w:hAnsi="Times New Roman"/>
           <w:sz w:val="28"/>
         </w:rPr>
         <w:t>7.  Đưa ra 10 ý tưởng hợp tác chiến lược cho startup bán SP/DV = [___].</w:t>
@@ -1828,17 +1922,18 @@
     </w:p>
     <w:p>
       <w:pPr>
-        <w:spacing/>
-        <w:ind w:left="620" w:hanging="360"/>
-        <w:rPr>
-          <w:rFonts w:ascii="Times New Roman" w:hAnsi="Times New Roman" w:cs="Times New Roman"/>
-          <w:sz w:val="28"/>
-          <w:szCs w:val="28"/>
-        </w:rPr>
-      </w:pPr>
-      <w:r>
-        <w:rPr>
-          <w:rFonts w:ascii="Times New Roman" w:hAnsi="Times New Roman" w:eastAsia="Times New Roman"/>
+        <w:spacing w:before="120" w:after="120" w:line="240" w:lineRule="auto"/>
+        <w:ind w:left="620" w:hanging="360"/>
+        <w:jc w:val="both"/>
+        <w:rPr>
+          <w:rFonts w:ascii="Times New Roman" w:hAnsi="Times New Roman" w:cs="Times New Roman"/>
+          <w:sz w:val="28"/>
+          <w:szCs w:val="28"/>
+        </w:rPr>
+      </w:pPr>
+      <w:r>
+        <w:rPr>
+          <w:rFonts w:ascii="Times New Roman" w:eastAsia="Times New Roman" w:hAnsi="Times New Roman"/>
           <w:sz w:val="28"/>
         </w:rPr>
         <w:t>8.  Viết roadmap 3 năm để một startup nhỏ kinh doanh SP/DV = [___] trở thành công ty dẫn đầu thị trường.</w:t>
@@ -1846,17 +1941,18 @@
     </w:p>
     <w:p>
       <w:pPr>
-        <w:spacing/>
-        <w:ind w:left="620" w:hanging="360"/>
-        <w:rPr>
-          <w:rFonts w:ascii="Times New Roman" w:hAnsi="Times New Roman" w:cs="Times New Roman"/>
-          <w:sz w:val="28"/>
-          <w:szCs w:val="28"/>
-        </w:rPr>
-      </w:pPr>
-      <w:r>
-        <w:rPr>
-          <w:rFonts w:ascii="Times New Roman" w:hAnsi="Times New Roman" w:eastAsia="Times New Roman"/>
+        <w:spacing w:before="120" w:after="120" w:line="240" w:lineRule="auto"/>
+        <w:ind w:left="620" w:hanging="360"/>
+        <w:jc w:val="both"/>
+        <w:rPr>
+          <w:rFonts w:ascii="Times New Roman" w:hAnsi="Times New Roman" w:cs="Times New Roman"/>
+          <w:sz w:val="28"/>
+          <w:szCs w:val="28"/>
+        </w:rPr>
+      </w:pPr>
+      <w:r>
+        <w:rPr>
+          <w:rFonts w:ascii="Times New Roman" w:eastAsia="Times New Roman" w:hAnsi="Times New Roman"/>
           <w:sz w:val="28"/>
         </w:rPr>
         <w:t>9.  Soạn bản kế hoạch gọi vốn cộng đồng (crowdfunding) cho SP/DV = [___].</w:t>
@@ -1864,17 +1960,18 @@
     </w:p>
     <w:p>
       <w:pPr>
-        <w:spacing/>
-        <w:ind w:left="620" w:hanging="360"/>
-        <w:rPr>
-          <w:rFonts w:ascii="Times New Roman" w:hAnsi="Times New Roman" w:cs="Times New Roman"/>
-          <w:sz w:val="28"/>
-          <w:szCs w:val="28"/>
-        </w:rPr>
-      </w:pPr>
-      <w:r>
-        <w:rPr>
-          <w:rFonts w:ascii="Times New Roman" w:hAnsi="Times New Roman" w:eastAsia="Times New Roman"/>
+        <w:spacing w:before="120" w:after="120" w:line="240" w:lineRule="auto"/>
+        <w:ind w:left="620" w:hanging="360"/>
+        <w:jc w:val="both"/>
+        <w:rPr>
+          <w:rFonts w:ascii="Times New Roman" w:hAnsi="Times New Roman" w:cs="Times New Roman"/>
+          <w:sz w:val="28"/>
+          <w:szCs w:val="28"/>
+        </w:rPr>
+      </w:pPr>
+      <w:r>
+        <w:rPr>
+          <w:rFonts w:ascii="Times New Roman" w:eastAsia="Times New Roman" w:hAnsi="Times New Roman"/>
           <w:sz w:val="28"/>
         </w:rPr>
         <w:t>10.Đưa ra danh sách 5 thị trường ngách tiềm năng cho SP/DV = [___].</w:t>
@@ -1882,8 +1979,8 @@
     </w:p>
     <w:p>
       <w:pPr>
-        <w:spacing/>
-        <w:ind/>
+        <w:spacing w:before="120" w:after="120" w:line="240" w:lineRule="auto"/>
+        <w:jc w:val="both"/>
         <w:rPr>
           <w:rFonts w:ascii="Times New Roman" w:hAnsi="Times New Roman" w:cs="Times New Roman"/>
           <w:b/>
@@ -1894,7 +1991,7 @@
       </w:pPr>
       <w:r>
         <w:rPr>
-          <w:rFonts w:ascii="Times New Roman" w:hAnsi="Times New Roman" w:eastAsia="Times New Roman"/>
+          <w:rFonts w:ascii="Times New Roman" w:eastAsia="Times New Roman" w:hAnsi="Times New Roman"/>
           <w:b/>
           <w:sz w:val="28"/>
         </w:rPr>
@@ -1903,17 +2000,18 @@
     </w:p>
     <w:p>
       <w:pPr>
-        <w:spacing/>
-        <w:ind w:left="620" w:hanging="360"/>
-        <w:rPr>
-          <w:rFonts w:ascii="Times New Roman" w:hAnsi="Times New Roman" w:cs="Times New Roman"/>
-          <w:sz w:val="28"/>
-          <w:szCs w:val="28"/>
-        </w:rPr>
-      </w:pPr>
-      <w:r>
-        <w:rPr>
-          <w:rFonts w:ascii="Times New Roman" w:hAnsi="Times New Roman" w:eastAsia="Times New Roman"/>
+        <w:spacing w:before="120" w:after="120" w:line="240" w:lineRule="auto"/>
+        <w:ind w:left="620" w:hanging="360"/>
+        <w:jc w:val="both"/>
+        <w:rPr>
+          <w:rFonts w:ascii="Times New Roman" w:hAnsi="Times New Roman" w:cs="Times New Roman"/>
+          <w:sz w:val="28"/>
+          <w:szCs w:val="28"/>
+        </w:rPr>
+      </w:pPr>
+      <w:r>
+        <w:rPr>
+          <w:rFonts w:ascii="Times New Roman" w:eastAsia="Times New Roman" w:hAnsi="Times New Roman"/>
           <w:sz w:val="28"/>
         </w:rPr>
         <w:t>1.  Hãy thiết kế hệ thống chatbot AI hỗ trợ bán hàng cho SP/DV = [___], kịch bản chi tiết.</w:t>
@@ -1921,17 +2019,18 @@
     </w:p>
     <w:p>
       <w:pPr>
-        <w:spacing/>
-        <w:ind w:left="620" w:hanging="360"/>
-        <w:rPr>
-          <w:rFonts w:ascii="Times New Roman" w:hAnsi="Times New Roman" w:cs="Times New Roman"/>
-          <w:sz w:val="28"/>
-          <w:szCs w:val="28"/>
-        </w:rPr>
-      </w:pPr>
-      <w:r>
-        <w:rPr>
-          <w:rFonts w:ascii="Times New Roman" w:hAnsi="Times New Roman" w:eastAsia="Times New Roman"/>
+        <w:spacing w:before="120" w:after="120" w:line="240" w:lineRule="auto"/>
+        <w:ind w:left="620" w:hanging="360"/>
+        <w:jc w:val="both"/>
+        <w:rPr>
+          <w:rFonts w:ascii="Times New Roman" w:hAnsi="Times New Roman" w:cs="Times New Roman"/>
+          <w:sz w:val="28"/>
+          <w:szCs w:val="28"/>
+        </w:rPr>
+      </w:pPr>
+      <w:r>
+        <w:rPr>
+          <w:rFonts w:ascii="Times New Roman" w:eastAsia="Times New Roman" w:hAnsi="Times New Roman"/>
           <w:sz w:val="28"/>
         </w:rPr>
         <w:t>2.  Viết kế hoạch ứng dụng AI trong marketing automation cho SP/DV = [___].</w:t>
@@ -1939,17 +2038,18 @@
     </w:p>
     <w:p>
       <w:pPr>
-        <w:spacing/>
-        <w:ind w:left="620" w:hanging="360"/>
-        <w:rPr>
-          <w:rFonts w:ascii="Times New Roman" w:hAnsi="Times New Roman" w:cs="Times New Roman"/>
-          <w:sz w:val="28"/>
-          <w:szCs w:val="28"/>
-        </w:rPr>
-      </w:pPr>
-      <w:r>
-        <w:rPr>
-          <w:rFonts w:ascii="Times New Roman" w:hAnsi="Times New Roman" w:eastAsia="Times New Roman"/>
+        <w:spacing w:before="120" w:after="120" w:line="240" w:lineRule="auto"/>
+        <w:ind w:left="620" w:hanging="360"/>
+        <w:jc w:val="both"/>
+        <w:rPr>
+          <w:rFonts w:ascii="Times New Roman" w:hAnsi="Times New Roman" w:cs="Times New Roman"/>
+          <w:sz w:val="28"/>
+          <w:szCs w:val="28"/>
+        </w:rPr>
+      </w:pPr>
+      <w:r>
+        <w:rPr>
+          <w:rFonts w:ascii="Times New Roman" w:eastAsia="Times New Roman" w:hAnsi="Times New Roman"/>
           <w:sz w:val="28"/>
         </w:rPr>
         <w:t>3.  Đưa ra ý tưởng sử dụng AI để phân tích hành vi khách hàng khi mua SP/DV = [___].</w:t>
@@ -1957,35 +2057,38 @@
     </w:p>
     <w:p>
       <w:pPr>
-        <w:spacing/>
-        <w:ind w:left="620" w:hanging="360"/>
-        <w:rPr>
-          <w:rFonts w:ascii="Times New Roman" w:hAnsi="Times New Roman" w:cs="Times New Roman"/>
-          <w:sz w:val="28"/>
-          <w:szCs w:val="28"/>
-        </w:rPr>
-      </w:pPr>
-      <w:r>
-        <w:rPr>
-          <w:rFonts w:ascii="Times New Roman" w:hAnsi="Times New Roman" w:eastAsia="Times New Roman"/>
-          <w:sz w:val="28"/>
-        </w:rPr>
+        <w:spacing w:before="120" w:after="120" w:line="240" w:lineRule="auto"/>
+        <w:ind w:left="620" w:hanging="360"/>
+        <w:jc w:val="both"/>
+        <w:rPr>
+          <w:rFonts w:ascii="Times New Roman" w:hAnsi="Times New Roman" w:cs="Times New Roman"/>
+          <w:sz w:val="28"/>
+          <w:szCs w:val="28"/>
+        </w:rPr>
+      </w:pPr>
+      <w:r>
+        <w:rPr>
+          <w:rFonts w:ascii="Times New Roman" w:eastAsia="Times New Roman" w:hAnsi="Times New Roman"/>
+          <w:sz w:val="28"/>
+        </w:rPr>
+        <w:lastRenderedPageBreak/>
         <w:t>4.  Soạn lộ trình ứng dụng blockchain để tăng tính minh bạch khi giao dịch SP/DV = [___].</w:t>
       </w:r>
     </w:p>
     <w:p>
       <w:pPr>
-        <w:spacing/>
-        <w:ind w:left="620" w:hanging="360"/>
-        <w:rPr>
-          <w:rFonts w:ascii="Times New Roman" w:hAnsi="Times New Roman" w:cs="Times New Roman"/>
-          <w:sz w:val="28"/>
-          <w:szCs w:val="28"/>
-        </w:rPr>
-      </w:pPr>
-      <w:r>
-        <w:rPr>
-          <w:rFonts w:ascii="Times New Roman" w:hAnsi="Times New Roman" w:eastAsia="Times New Roman"/>
+        <w:spacing w:before="120" w:after="120" w:line="240" w:lineRule="auto"/>
+        <w:ind w:left="620" w:hanging="360"/>
+        <w:jc w:val="both"/>
+        <w:rPr>
+          <w:rFonts w:ascii="Times New Roman" w:hAnsi="Times New Roman" w:cs="Times New Roman"/>
+          <w:sz w:val="28"/>
+          <w:szCs w:val="28"/>
+        </w:rPr>
+      </w:pPr>
+      <w:r>
+        <w:rPr>
+          <w:rFonts w:ascii="Times New Roman" w:eastAsia="Times New Roman" w:hAnsi="Times New Roman"/>
           <w:sz w:val="28"/>
         </w:rPr>
         <w:t>5.  Viết kế hoạch dùng dữ liệu lớn (Big Data) để tối ưu chiến lược bán SP/DV = [___].</w:t>
@@ -1993,17 +2096,18 @@
     </w:p>
     <w:p>
       <w:pPr>
-        <w:spacing/>
-        <w:ind w:left="620" w:hanging="360"/>
-        <w:rPr>
-          <w:rFonts w:ascii="Times New Roman" w:hAnsi="Times New Roman" w:cs="Times New Roman"/>
-          <w:sz w:val="28"/>
-          <w:szCs w:val="28"/>
-        </w:rPr>
-      </w:pPr>
-      <w:r>
-        <w:rPr>
-          <w:rFonts w:ascii="Times New Roman" w:hAnsi="Times New Roman" w:eastAsia="Times New Roman"/>
+        <w:spacing w:before="120" w:after="120" w:line="240" w:lineRule="auto"/>
+        <w:ind w:left="620" w:hanging="360"/>
+        <w:jc w:val="both"/>
+        <w:rPr>
+          <w:rFonts w:ascii="Times New Roman" w:hAnsi="Times New Roman" w:cs="Times New Roman"/>
+          <w:sz w:val="28"/>
+          <w:szCs w:val="28"/>
+        </w:rPr>
+      </w:pPr>
+      <w:r>
+        <w:rPr>
+          <w:rFonts w:ascii="Times New Roman" w:eastAsia="Times New Roman" w:hAnsi="Times New Roman"/>
           <w:sz w:val="28"/>
         </w:rPr>
         <w:t>6.  Hãy đưa ra cách ứng dụng ChatGPT để tạo nội dung marketing cho SP/DV = [___].</w:t>
@@ -2011,17 +2115,18 @@
     </w:p>
     <w:p>
       <w:pPr>
-        <w:spacing/>
-        <w:ind w:left="620" w:hanging="360"/>
-        <w:rPr>
-          <w:rFonts w:ascii="Times New Roman" w:hAnsi="Times New Roman" w:cs="Times New Roman"/>
-          <w:sz w:val="28"/>
-          <w:szCs w:val="28"/>
-        </w:rPr>
-      </w:pPr>
-      <w:r>
-        <w:rPr>
-          <w:rFonts w:ascii="Times New Roman" w:hAnsi="Times New Roman" w:eastAsia="Times New Roman"/>
+        <w:spacing w:before="120" w:after="120" w:line="240" w:lineRule="auto"/>
+        <w:ind w:left="620" w:hanging="360"/>
+        <w:jc w:val="both"/>
+        <w:rPr>
+          <w:rFonts w:ascii="Times New Roman" w:hAnsi="Times New Roman" w:cs="Times New Roman"/>
+          <w:sz w:val="28"/>
+          <w:szCs w:val="28"/>
+        </w:rPr>
+      </w:pPr>
+      <w:r>
+        <w:rPr>
+          <w:rFonts w:ascii="Times New Roman" w:eastAsia="Times New Roman" w:hAnsi="Times New Roman"/>
           <w:sz w:val="28"/>
         </w:rPr>
         <w:t>7.  Viết kế hoạch chuyển đổi số toàn diện cho doanh nghiệp kinh doanh SP/DV = [___].</w:t>
@@ -2029,17 +2134,18 @@
     </w:p>
     <w:p>
       <w:pPr>
-        <w:spacing/>
-        <w:ind w:left="620" w:hanging="360"/>
-        <w:rPr>
-          <w:rFonts w:ascii="Times New Roman" w:hAnsi="Times New Roman" w:cs="Times New Roman"/>
-          <w:sz w:val="28"/>
-          <w:szCs w:val="28"/>
-        </w:rPr>
-      </w:pPr>
-      <w:r>
-        <w:rPr>
-          <w:rFonts w:ascii="Times New Roman" w:hAnsi="Times New Roman" w:eastAsia="Times New Roman"/>
+        <w:spacing w:before="120" w:after="120" w:line="240" w:lineRule="auto"/>
+        <w:ind w:left="620" w:hanging="360"/>
+        <w:jc w:val="both"/>
+        <w:rPr>
+          <w:rFonts w:ascii="Times New Roman" w:hAnsi="Times New Roman" w:cs="Times New Roman"/>
+          <w:sz w:val="28"/>
+          <w:szCs w:val="28"/>
+        </w:rPr>
+      </w:pPr>
+      <w:r>
+        <w:rPr>
+          <w:rFonts w:ascii="Times New Roman" w:eastAsia="Times New Roman" w:hAnsi="Times New Roman"/>
           <w:sz w:val="28"/>
         </w:rPr>
         <w:t>8.  Đưa ra chiến lược sử dụng AR/VR để trải nghiệm thử SP/DV = [___].</w:t>
@@ -2047,17 +2153,18 @@
     </w:p>
     <w:p>
       <w:pPr>
-        <w:spacing/>
-        <w:ind w:left="620" w:hanging="360"/>
-        <w:rPr>
-          <w:rFonts w:ascii="Times New Roman" w:hAnsi="Times New Roman" w:cs="Times New Roman"/>
-          <w:sz w:val="28"/>
-          <w:szCs w:val="28"/>
-        </w:rPr>
-      </w:pPr>
-      <w:r>
-        <w:rPr>
-          <w:rFonts w:ascii="Times New Roman" w:hAnsi="Times New Roman" w:eastAsia="Times New Roman"/>
+        <w:spacing w:before="120" w:after="120" w:line="240" w:lineRule="auto"/>
+        <w:ind w:left="620" w:hanging="360"/>
+        <w:jc w:val="both"/>
+        <w:rPr>
+          <w:rFonts w:ascii="Times New Roman" w:hAnsi="Times New Roman" w:cs="Times New Roman"/>
+          <w:sz w:val="28"/>
+          <w:szCs w:val="28"/>
+        </w:rPr>
+      </w:pPr>
+      <w:r>
+        <w:rPr>
+          <w:rFonts w:ascii="Times New Roman" w:eastAsia="Times New Roman" w:hAnsi="Times New Roman"/>
           <w:sz w:val="28"/>
         </w:rPr>
         <w:t>9.  Viết kịch bản ứng dụng IoT để nâng cao trải nghiệm người dùng với SP/DV = [___].</w:t>
@@ -2065,17 +2172,18 @@
     </w:p>
     <w:p>
       <w:pPr>
-        <w:spacing/>
-        <w:ind w:left="620" w:hanging="360"/>
-        <w:rPr>
-          <w:rFonts w:ascii="Times New Roman" w:hAnsi="Times New Roman" w:cs="Times New Roman"/>
-          <w:sz w:val="28"/>
-          <w:szCs w:val="28"/>
-        </w:rPr>
-      </w:pPr>
-      <w:r>
-        <w:rPr>
-          <w:rFonts w:ascii="Times New Roman" w:hAnsi="Times New Roman" w:eastAsia="Times New Roman"/>
+        <w:spacing w:before="120" w:after="120" w:line="240" w:lineRule="auto"/>
+        <w:ind w:left="620" w:hanging="360"/>
+        <w:jc w:val="both"/>
+        <w:rPr>
+          <w:rFonts w:ascii="Times New Roman" w:hAnsi="Times New Roman" w:cs="Times New Roman"/>
+          <w:sz w:val="28"/>
+          <w:szCs w:val="28"/>
+        </w:rPr>
+      </w:pPr>
+      <w:r>
+        <w:rPr>
+          <w:rFonts w:ascii="Times New Roman" w:eastAsia="Times New Roman" w:hAnsi="Times New Roman"/>
           <w:sz w:val="28"/>
         </w:rPr>
         <w:t>10.Hãy thiết kế hệ thống CRM tự động hóa cho công ty cung cấp SP/DV = [___].</w:t>
@@ -2083,9 +2191,8 @@
     </w:p>
     <w:p>
       <w:pPr>
-        <w:keepNext w:val="0"/>
-        <w:keepLines w:val="0"/>
-        <w:spacing/>
+        <w:spacing w:before="120" w:after="120" w:line="240" w:lineRule="auto"/>
+        <w:jc w:val="both"/>
         <w:rPr>
           <w:rFonts w:ascii="Times New Roman" w:hAnsi="Times New Roman" w:cs="Times New Roman"/>
           <w:b/>
@@ -2096,7 +2203,7 @@
       </w:pPr>
       <w:r>
         <w:rPr>
-          <w:rFonts w:ascii="Times New Roman" w:hAnsi="Times New Roman" w:eastAsia="Times New Roman"/>
+          <w:rFonts w:ascii="Times New Roman" w:eastAsia="Times New Roman" w:hAnsi="Times New Roman"/>
           <w:b/>
           <w:sz w:val="28"/>
         </w:rPr>
@@ -2105,17 +2212,18 @@
     </w:p>
     <w:p>
       <w:pPr>
-        <w:spacing/>
-        <w:ind w:left="620" w:hanging="360"/>
-        <w:rPr>
-          <w:rFonts w:ascii="Times New Roman" w:hAnsi="Times New Roman" w:cs="Times New Roman"/>
-          <w:sz w:val="28"/>
-          <w:szCs w:val="28"/>
-        </w:rPr>
-      </w:pPr>
-      <w:r>
-        <w:rPr>
-          <w:rFonts w:ascii="Times New Roman" w:hAnsi="Times New Roman" w:eastAsia="Times New Roman"/>
+        <w:spacing w:before="120" w:after="120" w:line="240" w:lineRule="auto"/>
+        <w:ind w:left="620" w:hanging="360"/>
+        <w:jc w:val="both"/>
+        <w:rPr>
+          <w:rFonts w:ascii="Times New Roman" w:hAnsi="Times New Roman" w:cs="Times New Roman"/>
+          <w:sz w:val="28"/>
+          <w:szCs w:val="28"/>
+        </w:rPr>
+      </w:pPr>
+      <w:r>
+        <w:rPr>
+          <w:rFonts w:ascii="Times New Roman" w:eastAsia="Times New Roman" w:hAnsi="Times New Roman"/>
           <w:sz w:val="28"/>
         </w:rPr>
         <w:t>1.  Hãy viết bài diễn văn 5 phút truyền cảm hứng cho đội ngũ sales bán SP/DV = [___] đạt mục tiêu.</w:t>
@@ -2123,17 +2231,18 @@
     </w:p>
     <w:p>
       <w:pPr>
-        <w:spacing/>
-        <w:ind w:left="620" w:hanging="360"/>
-        <w:rPr>
-          <w:rFonts w:ascii="Times New Roman" w:hAnsi="Times New Roman" w:cs="Times New Roman"/>
-          <w:sz w:val="28"/>
-          <w:szCs w:val="28"/>
-        </w:rPr>
-      </w:pPr>
-      <w:r>
-        <w:rPr>
-          <w:rFonts w:ascii="Times New Roman" w:hAnsi="Times New Roman" w:eastAsia="Times New Roman"/>
+        <w:spacing w:before="120" w:after="120" w:line="240" w:lineRule="auto"/>
+        <w:ind w:left="620" w:hanging="360"/>
+        <w:jc w:val="both"/>
+        <w:rPr>
+          <w:rFonts w:ascii="Times New Roman" w:hAnsi="Times New Roman" w:cs="Times New Roman"/>
+          <w:sz w:val="28"/>
+          <w:szCs w:val="28"/>
+        </w:rPr>
+      </w:pPr>
+      <w:r>
+        <w:rPr>
+          <w:rFonts w:ascii="Times New Roman" w:eastAsia="Times New Roman" w:hAnsi="Times New Roman"/>
           <w:sz w:val="28"/>
         </w:rPr>
         <w:t>2.  Soạn 10 câu nói slogan mạnh mẽ để xây dựng tinh thần chiến đấu trong công ty kinh doanh SP/DV = [___].</w:t>
@@ -2141,17 +2250,18 @@
     </w:p>
     <w:p>
       <w:pPr>
-        <w:spacing/>
-        <w:ind w:left="620" w:hanging="360"/>
-        <w:rPr>
-          <w:rFonts w:ascii="Times New Roman" w:hAnsi="Times New Roman" w:cs="Times New Roman"/>
-          <w:sz w:val="28"/>
-          <w:szCs w:val="28"/>
-        </w:rPr>
-      </w:pPr>
-      <w:r>
-        <w:rPr>
-          <w:rFonts w:ascii="Times New Roman" w:hAnsi="Times New Roman" w:eastAsia="Times New Roman"/>
+        <w:spacing w:before="120" w:after="120" w:line="240" w:lineRule="auto"/>
+        <w:ind w:left="620" w:hanging="360"/>
+        <w:jc w:val="both"/>
+        <w:rPr>
+          <w:rFonts w:ascii="Times New Roman" w:hAnsi="Times New Roman" w:cs="Times New Roman"/>
+          <w:sz w:val="28"/>
+          <w:szCs w:val="28"/>
+        </w:rPr>
+      </w:pPr>
+      <w:r>
+        <w:rPr>
+          <w:rFonts w:ascii="Times New Roman" w:eastAsia="Times New Roman" w:hAnsi="Times New Roman"/>
           <w:sz w:val="28"/>
         </w:rPr>
         <w:t>3.  Viết bài phát biểu kêu gọi đầu tư cho startup cung cấp SP/DV = [___].</w:t>
@@ -2159,17 +2269,18 @@
     </w:p>
     <w:p>
       <w:pPr>
-        <w:spacing/>
-        <w:ind w:left="620" w:hanging="360"/>
-        <w:rPr>
-          <w:rFonts w:ascii="Times New Roman" w:hAnsi="Times New Roman" w:cs="Times New Roman"/>
-          <w:sz w:val="28"/>
-          <w:szCs w:val="28"/>
-        </w:rPr>
-      </w:pPr>
-      <w:r>
-        <w:rPr>
-          <w:rFonts w:ascii="Times New Roman" w:hAnsi="Times New Roman" w:eastAsia="Times New Roman"/>
+        <w:spacing w:before="120" w:after="120" w:line="240" w:lineRule="auto"/>
+        <w:ind w:left="620" w:hanging="360"/>
+        <w:jc w:val="both"/>
+        <w:rPr>
+          <w:rFonts w:ascii="Times New Roman" w:hAnsi="Times New Roman" w:cs="Times New Roman"/>
+          <w:sz w:val="28"/>
+          <w:szCs w:val="28"/>
+        </w:rPr>
+      </w:pPr>
+      <w:r>
+        <w:rPr>
+          <w:rFonts w:ascii="Times New Roman" w:eastAsia="Times New Roman" w:hAnsi="Times New Roman"/>
           <w:sz w:val="28"/>
         </w:rPr>
         <w:t>4.  Hãy tạo danh sách 20 câu hỏi kích thích tư duy sáng tạo cho đội ngũ R&amp;D phát triển SP/DV = [___].</w:t>
@@ -2177,17 +2288,18 @@
     </w:p>
     <w:p>
       <w:pPr>
-        <w:spacing/>
-        <w:ind w:left="620" w:hanging="360"/>
-        <w:rPr>
-          <w:rFonts w:ascii="Times New Roman" w:hAnsi="Times New Roman" w:cs="Times New Roman"/>
-          <w:sz w:val="28"/>
-          <w:szCs w:val="28"/>
-        </w:rPr>
-      </w:pPr>
-      <w:r>
-        <w:rPr>
-          <w:rFonts w:ascii="Times New Roman" w:hAnsi="Times New Roman" w:eastAsia="Times New Roman"/>
+        <w:spacing w:before="120" w:after="120" w:line="240" w:lineRule="auto"/>
+        <w:ind w:left="620" w:hanging="360"/>
+        <w:jc w:val="both"/>
+        <w:rPr>
+          <w:rFonts w:ascii="Times New Roman" w:hAnsi="Times New Roman" w:cs="Times New Roman"/>
+          <w:sz w:val="28"/>
+          <w:szCs w:val="28"/>
+        </w:rPr>
+      </w:pPr>
+      <w:r>
+        <w:rPr>
+          <w:rFonts w:ascii="Times New Roman" w:eastAsia="Times New Roman" w:hAnsi="Times New Roman"/>
           <w:sz w:val="28"/>
         </w:rPr>
         <w:t>5.  Soạn bài viết truyền động lực dành cho các nhà khởi nghiệp trong ngành SP/DV = [___].</w:t>
@@ -2195,17 +2307,18 @@
     </w:p>
     <w:p>
       <w:pPr>
-        <w:spacing/>
-        <w:ind w:left="620" w:hanging="360"/>
-        <w:rPr>
-          <w:rFonts w:ascii="Times New Roman" w:hAnsi="Times New Roman" w:cs="Times New Roman"/>
-          <w:sz w:val="28"/>
-          <w:szCs w:val="28"/>
-        </w:rPr>
-      </w:pPr>
-      <w:r>
-        <w:rPr>
-          <w:rFonts w:ascii="Times New Roman" w:hAnsi="Times New Roman" w:eastAsia="Times New Roman"/>
+        <w:spacing w:before="120" w:after="120" w:line="240" w:lineRule="auto"/>
+        <w:ind w:left="620" w:hanging="360"/>
+        <w:jc w:val="both"/>
+        <w:rPr>
+          <w:rFonts w:ascii="Times New Roman" w:hAnsi="Times New Roman" w:cs="Times New Roman"/>
+          <w:sz w:val="28"/>
+          <w:szCs w:val="28"/>
+        </w:rPr>
+      </w:pPr>
+      <w:r>
+        <w:rPr>
+          <w:rFonts w:ascii="Times New Roman" w:eastAsia="Times New Roman" w:hAnsi="Times New Roman"/>
           <w:sz w:val="28"/>
         </w:rPr>
         <w:t>6.  Viết bài diễn văn dành cho CEO khi công ty SP/DV = [___] đạt cột mốc doanh thu 100 tỷ.</w:t>
@@ -2213,17 +2326,18 @@
     </w:p>
     <w:p>
       <w:pPr>
-        <w:spacing/>
-        <w:ind w:left="620" w:hanging="360"/>
-        <w:rPr>
-          <w:rFonts w:ascii="Times New Roman" w:hAnsi="Times New Roman" w:cs="Times New Roman"/>
-          <w:sz w:val="28"/>
-          <w:szCs w:val="28"/>
-        </w:rPr>
-      </w:pPr>
-      <w:r>
-        <w:rPr>
-          <w:rFonts w:ascii="Times New Roman" w:hAnsi="Times New Roman" w:eastAsia="Times New Roman"/>
+        <w:spacing w:before="120" w:after="120" w:line="240" w:lineRule="auto"/>
+        <w:ind w:left="620" w:hanging="360"/>
+        <w:jc w:val="both"/>
+        <w:rPr>
+          <w:rFonts w:ascii="Times New Roman" w:hAnsi="Times New Roman" w:cs="Times New Roman"/>
+          <w:sz w:val="28"/>
+          <w:szCs w:val="28"/>
+        </w:rPr>
+      </w:pPr>
+      <w:r>
+        <w:rPr>
+          <w:rFonts w:ascii="Times New Roman" w:eastAsia="Times New Roman" w:hAnsi="Times New Roman"/>
           <w:sz w:val="28"/>
         </w:rPr>
         <w:t>7.  Hãy viết bài chia sẻ câu chuyện thương hiệu đầy cảm hứng về hành trình xây dựng SP/DV = [___].</w:t>
@@ -2231,17 +2345,18 @@
     </w:p>
     <w:p>
       <w:pPr>
-        <w:spacing/>
-        <w:ind w:left="620" w:hanging="360"/>
-        <w:rPr>
-          <w:rFonts w:ascii="Times New Roman" w:hAnsi="Times New Roman" w:cs="Times New Roman"/>
-          <w:sz w:val="28"/>
-          <w:szCs w:val="28"/>
-        </w:rPr>
-      </w:pPr>
-      <w:r>
-        <w:rPr>
-          <w:rFonts w:ascii="Times New Roman" w:hAnsi="Times New Roman" w:eastAsia="Times New Roman"/>
+        <w:spacing w:before="120" w:after="120" w:line="240" w:lineRule="auto"/>
+        <w:ind w:left="620" w:hanging="360"/>
+        <w:jc w:val="both"/>
+        <w:rPr>
+          <w:rFonts w:ascii="Times New Roman" w:hAnsi="Times New Roman" w:cs="Times New Roman"/>
+          <w:sz w:val="28"/>
+          <w:szCs w:val="28"/>
+        </w:rPr>
+      </w:pPr>
+      <w:r>
+        <w:rPr>
+          <w:rFonts w:ascii="Times New Roman" w:eastAsia="Times New Roman" w:hAnsi="Times New Roman"/>
           <w:sz w:val="28"/>
         </w:rPr>
         <w:t>8.  Soạn bản tuyên ngôn sứ mệnh &amp; giá trị cốt lõi cho công ty cung cấp SP/DV = [___].</w:t>
@@ -2249,17 +2364,18 @@
     </w:p>
     <w:p>
       <w:pPr>
-        <w:spacing/>
-        <w:ind w:left="620" w:hanging="360"/>
-        <w:rPr>
-          <w:rFonts w:ascii="Times New Roman" w:hAnsi="Times New Roman" w:cs="Times New Roman"/>
-          <w:sz w:val="28"/>
-          <w:szCs w:val="28"/>
-        </w:rPr>
-      </w:pPr>
-      <w:r>
-        <w:rPr>
-          <w:rFonts w:ascii="Times New Roman" w:hAnsi="Times New Roman" w:eastAsia="Times New Roman"/>
+        <w:spacing w:before="120" w:after="120" w:line="240" w:lineRule="auto"/>
+        <w:ind w:left="620" w:hanging="360"/>
+        <w:jc w:val="both"/>
+        <w:rPr>
+          <w:rFonts w:ascii="Times New Roman" w:hAnsi="Times New Roman" w:cs="Times New Roman"/>
+          <w:sz w:val="28"/>
+          <w:szCs w:val="28"/>
+        </w:rPr>
+      </w:pPr>
+      <w:r>
+        <w:rPr>
+          <w:rFonts w:ascii="Times New Roman" w:eastAsia="Times New Roman" w:hAnsi="Times New Roman"/>
           <w:sz w:val="28"/>
         </w:rPr>
         <w:t>9.  Hãy viết 10 trích dẫn động lực để treo văn phòng cho đội ngũ bán hàng SP/DV = [___].</w:t>
@@ -2267,17 +2383,18 @@
     </w:p>
     <w:p>
       <w:pPr>
-        <w:spacing/>
-        <w:ind w:left="620" w:hanging="360"/>
-        <w:rPr>
-          <w:rFonts w:ascii="Times New Roman" w:hAnsi="Times New Roman" w:cs="Times New Roman"/>
-          <w:sz w:val="28"/>
-          <w:szCs w:val="28"/>
-        </w:rPr>
-      </w:pPr>
-      <w:r>
-        <w:rPr>
-          <w:rFonts w:ascii="Times New Roman" w:hAnsi="Times New Roman" w:eastAsia="Times New Roman"/>
+        <w:spacing w:before="120" w:after="120" w:line="240" w:lineRule="auto"/>
+        <w:ind w:left="620" w:hanging="360"/>
+        <w:jc w:val="both"/>
+        <w:rPr>
+          <w:rFonts w:ascii="Times New Roman" w:hAnsi="Times New Roman" w:cs="Times New Roman"/>
+          <w:sz w:val="28"/>
+          <w:szCs w:val="28"/>
+        </w:rPr>
+      </w:pPr>
+      <w:r>
+        <w:rPr>
+          <w:rFonts w:ascii="Times New Roman" w:eastAsia="Times New Roman" w:hAnsi="Times New Roman"/>
           <w:sz w:val="28"/>
         </w:rPr>
         <w:t>10.Viết kịch bản video truyền cảm hứng 2 phút về tầm nhìn dài hạn của SP/DV = [___].</w:t>

</xml_diff>